<commit_message>
docs(entrega): transferência e bateria de testes alinhadas ao que está no ar
No documento de transferência entra uma seção com a situação em 26/10:
dono de cada serviço e como passa para a UNAERP, prazos, como trocar as
senhas sem escrevê-las, o banco com delete_own_account, versões e
rulesets, a tag do INPI, as rotinas que mantêm o banco acordado, DNS e
as limitações conhecidas. Também corrige o que estava desatualizado:
segredos que seguem com o repositório, Redirect URLs, limites de email,
comportamento com o projeto pausado e cópia de segurança pela linha de
comando.

A bateria passa a 32 testes, com troca de conta no mesmo navegador,
progresso jogado sem conta, exclusão conferida no painel, teclado,
domínio e proteções do repositório. Os anexos de diagramas ficam como
estão porque descrevem a versão registrada no INPI.
</commit_message>
<xml_diff>
--- a/docs/Ecoverse - Bateria de testes.docx
+++ b/docs/Ecoverse - Bateria de testes.docx
@@ -107,7 +107,7 @@
           <w:sz w:val="20"/>
           <w:szCs w:val="20"/>
         </w:rPr>
-        <w:t xml:space="preserve">Documento revisado em 9 de agosto de 2026</w:t>
+        <w:t xml:space="preserve">Documento revisado em 26 de outubro de 2026</w:t>
       </w:r>
     </w:p>
     <w:p>
@@ -137,7 +137,7 @@
           <w:sz w:val="22"/>
           <w:szCs w:val="22"/>
         </w:rPr>
-        <w:t xml:space="preserve">Este roteiro existe para que qualquer pessoa, mesmo sem ter participado do desenvolvimento, consiga verificar se o Ecoverse está funcionando por inteiro. Ele foi escrito para ser executado do começo ao fim em cerca de quarenta minutos.</w:t>
+        <w:t xml:space="preserve">Este roteiro existe para que qualquer pessoa, mesmo sem ter participado do desenvolvimento, consiga verificar se o Ecoverse está funcionando por inteiro. Ele foi escrito para ser executado do começo ao fim em cerca de uma hora e meia.</w:t>
       </w:r>
     </w:p>
     <w:p>
@@ -216,7 +216,7 @@
           <w:sz w:val="22"/>
           <w:szCs w:val="22"/>
         </w:rPr>
-        <w:t xml:space="preserve">Um endereço de email real que você consiga abrir na hora, porque o login envia um link.</w:t>
+        <w:t xml:space="preserve">Dois endereços de email reais que você consiga abrir na hora, porque o login envia um link e alguns testes usam duas contas.</w:t>
       </w:r>
     </w:p>
     <w:p>
@@ -247,7 +247,7 @@
           <w:sz w:val="22"/>
           <w:szCs w:val="22"/>
         </w:rPr>
-        <w:t xml:space="preserve">Abra o site em uma aba anônima. Isso garante que nenhum progresso antigo salvo no navegador atrapalhe a leitura dos resultados.</w:t>
+        <w:t xml:space="preserve">Abra o site em uma aba anônima. Isso garante que nenhum progresso antigo salvo no navegador atrapalhe a leitura dos resultados. Use a mesma janela anônima do começo ao fim, a não ser que o teste peça outra: fechar a janela apaga o que o navegador guardou.</w:t>
       </w:r>
     </w:p>
     <w:p>
@@ -293,7 +293,7 @@
           <w:sz w:val="22"/>
           <w:szCs w:val="22"/>
         </w:rPr>
-        <w:t xml:space="preserve">acrescentar ?dev=free ao endereço libera energia sem precisar completar sessões de Pomodoro. Serve para testar as missões rapidamente. Nesse modo o progresso não é salvo, então use apenas nos testes que pedem explicitamente.</w:t>
+        <w:t xml:space="preserve">acrescentar ?dev=free ao endereço libera todas as missões e a energia, sem precisar completar sessões de Pomodoro. Serve para testar as missões rapidamente. Nesse modo o progresso não é salvo, então use apenas nos testes que pedem explicitamente.</w:t>
       </w:r>
     </w:p>
     <w:p>
@@ -1056,7 +1056,7 @@
           <w:sz w:val="22"/>
           <w:szCs w:val="22"/>
         </w:rPr>
-        <w:t xml:space="preserve">Clique no ícone de troféu, no topo.</w:t>
+        <w:t xml:space="preserve">Clique no ícone de troféu, no topo. Depois feche a janela e digite ECO com a página em foco, fora de qualquer campo de texto; no celular, toque três vezes seguidas no contador de missões. Jogue a Triagem relâmpago que abrir.</w:t>
       </w:r>
     </w:p>
     <w:p>
@@ -1079,7 +1079,7 @@
           <w:sz w:val="22"/>
           <w:szCs w:val="22"/>
         </w:rPr>
-        <w:t xml:space="preserve">Aparecem 16 conquistas. As que você já cumpriu aparecem destacadas, e o contador no topo da janela reflete esse número. Uma delas é secreta e só aparece depois de descoberta.</w:t>
+        <w:t xml:space="preserve">Aparecem 16 conquistas. As que você já cumpriu aparecem destacadas, e o contador no topo da janela reflete esse número. Uma delas é secreta e só aparece depois de descoberta: digitar ECO abre a Triagem relâmpago, um minigame escondido, e acertar 60% ou mais libera essa conquista.</w:t>
       </w:r>
     </w:p>
     <w:p>
@@ -1193,7 +1193,7 @@
           <w:sz w:val="22"/>
           <w:szCs w:val="22"/>
         </w:rPr>
-        <w:t xml:space="preserve">Esta parte valida o cadastro por link de acesso, a sincronização e o ranking. Use um email real, porque o sistema envia uma mensagem de verdade.</w:t>
+        <w:t xml:space="preserve">Esta parte valida o cadastro por link de acesso, a sincronização e o ranking. Use emails reais, porque o sistema envia mensagens de verdade. A conta criada com o primeiro email é chamada aqui de conta A, e a criada com o segundo, de conta B.</w:t>
       </w:r>
     </w:p>
     <w:p>
@@ -1422,7 +1422,7 @@
           <w:sz w:val="22"/>
           <w:szCs w:val="22"/>
         </w:rPr>
-        <w:t xml:space="preserve">Peça o link duas ou três vezes seguidas para o mesmo email, com poucos minutos de intervalo.</w:t>
+        <w:t xml:space="preserve">Peça o link duas ou três vezes seguidas para o mesmo email, com poucos minutos de intervalo. Evite repetir este teste no dia de uma aula, porque cada pedido gasta um email da cota diária.</w:t>
       </w:r>
     </w:p>
     <w:p>
@@ -1445,7 +1445,7 @@
           <w:sz w:val="22"/>
           <w:szCs w:val="22"/>
         </w:rPr>
-        <w:t xml:space="preserve">Os links chegam normalmente. Caso o servidor recuse por excesso de tentativas, o que é raro no volume de uma turma, aparece um aviso pedindo para aguardar alguns minutos. Em nenhuma hipótese o botão pode ficar travado ou surgir mensagem técnica na tela.</w:t>
+        <w:t xml:space="preserve">Os links chegam normalmente. O Supabase aceita até 100 emails por hora no projeto inteiro, e o plano gratuito do Resend, até 100 por dia. Se algum limite for atingido, aparece um aviso pedindo para esperar ou tentar de novo. Em nenhuma hipótese o botão pode ficar travado ou surgir mensagem técnica na tela.</w:t>
       </w:r>
     </w:p>
     <w:p>
@@ -1506,7 +1506,7 @@
           <w:sz w:val="22"/>
           <w:szCs w:val="22"/>
         </w:rPr>
-        <w:t xml:space="preserve">Abra o email recebido e clique no botão de acesso.</w:t>
+        <w:t xml:space="preserve">Abra o email mais recente e clique no botão de acesso.</w:t>
       </w:r>
     </w:p>
     <w:p>
@@ -1529,7 +1529,7 @@
           <w:sz w:val="22"/>
           <w:szCs w:val="22"/>
         </w:rPr>
-        <w:t xml:space="preserve">O navegador volta para o Ecoverse já autenticado. O menu passa a mostrar as opções de quem tem conta, incluindo baixar os próprios dados, excluir a conta e sair.</w:t>
+        <w:t xml:space="preserve">O email chega com o remetente “Ecoverse” &lt;noreply@auth.ecoverse.dev&gt;, o assunto Seu acesso ao Ecoverse e o modelo com a marca, sem texto em inglês. O botão leva de volta para https://ecoverse.dev, já autenticado. Como o navegador tem o progresso jogado na Parte 1, aparece a pergunta “Este navegador tem progresso que não está em nenhuma conta: X missões e Y moedas. Quer juntar esse progresso à sua conta?”, com os números da Parte 1. Escolha OK: esse progresso passa a ser da conta A. O menu passa a mostrar as opções de quem tem conta, incluindo baixar os próprios dados, excluir a conta e sair.</w:t>
       </w:r>
     </w:p>
     <w:p>
@@ -1590,7 +1590,7 @@
           <w:sz w:val="22"/>
           <w:szCs w:val="22"/>
         </w:rPr>
-        <w:t xml:space="preserve">Estando logado, conclua uma missão e aguarde alguns segundos. Depois abra o mesmo endereço em outro navegador ou em outro aparelho e entre com o mesmo email.</w:t>
+        <w:t xml:space="preserve">Estando logado, conclua uma missão e aguarde alguns segundos. Depois abra o mesmo endereço em outro navegador ou em outro aparelho e entre com o mesmo email. Com os dois abertos, responda um quiz ODS no primeiro.</w:t>
       </w:r>
     </w:p>
     <w:p>
@@ -1613,7 +1613,7 @@
           <w:sz w:val="22"/>
           <w:szCs w:val="22"/>
         </w:rPr>
-        <w:t xml:space="preserve">O progresso aparece no segundo aparelho. Missões concluídas, moedas e impacto batem com o primeiro.</w:t>
+        <w:t xml:space="preserve">O progresso aparece no segundo aparelho. Missões concluídas, moedas e impacto batem com o primeiro. O email desse segundo acesso também chega com a marca. O resultado do quiz aparece no segundo aparelho sem recarregar a página, com o aviso “Progresso atualizado em outro dispositivo”.</w:t>
       </w:r>
     </w:p>
     <w:p>
@@ -1758,7 +1758,7 @@
           <w:sz w:val="22"/>
           <w:szCs w:val="22"/>
         </w:rPr>
-        <w:t xml:space="preserve">Crie uma conta deixando o campo de nome de exibição em branco e depois abra o ranking.</w:t>
+        <w:t xml:space="preserve">Saia da conta A. Depois entre com o segundo email, deixando em branco o campo de nome de exibição, e abra o ranking.</w:t>
       </w:r>
     </w:p>
     <w:p>
@@ -1781,7 +1781,7 @@
           <w:sz w:val="22"/>
           <w:szCs w:val="22"/>
         </w:rPr>
-        <w:t xml:space="preserve">O apelido gerado tem o formato Eco-explorador seguido de quatro caracteres. Ele não pode conter nenhum pedaço do seu email.</w:t>
+        <w:t xml:space="preserve">O apelido gerado tem o formato Eco-explorador seguido de quatro caracteres. Ele não pode conter nenhum pedaço do seu email. Esta é a conta B, que volta a ser usada na Parte 3.</w:t>
       </w:r>
     </w:p>
     <w:p>
@@ -1811,7 +1811,7 @@
           <w:sz w:val="22"/>
           <w:szCs w:val="22"/>
         </w:rPr>
-        <w:t xml:space="preserve">Esta parte confirma que a plataforma cumpre na prática o que a política de privacidade promete. É a parte mais sensível de uma entrega institucional.</w:t>
+        <w:t xml:space="preserve">Esta parte confirma que a plataforma cumpre na prática o que a política de privacidade promete. É a parte mais sensível de uma entrega institucional. Ela usa as duas contas criadas na Parte 2.</w:t>
       </w:r>
     </w:p>
     <w:p>
@@ -1872,7 +1872,7 @@
           <w:sz w:val="22"/>
           <w:szCs w:val="22"/>
         </w:rPr>
-        <w:t xml:space="preserve">Estando logado, abra o menu e escolha baixar meus dados.</w:t>
+        <w:t xml:space="preserve">Saia da conta B e entre de novo com a conta A. Abra o menu e escolha baixar meus dados. Guarde o arquivo, que é usado no teste T30.</w:t>
       </w:r>
     </w:p>
     <w:p>
@@ -1895,7 +1895,7 @@
           <w:sz w:val="22"/>
           <w:szCs w:val="22"/>
         </w:rPr>
-        <w:t xml:space="preserve">O navegador baixa um arquivo JSON com o progresso, as conquistas e o histórico de sessões. Abra o arquivo e confira se o conteúdo corresponde ao que você fez.</w:t>
+        <w:t xml:space="preserve">O navegador baixa um arquivo JSON com o progresso, as conquistas e o histórico de sessões. Abra o arquivo e confira se o conteúdo corresponde ao que você fez. O arquivo traz também o email e o identificador da conta.</w:t>
       </w:r>
     </w:p>
     <w:p>
@@ -1956,7 +1956,7 @@
           <w:sz w:val="22"/>
           <w:szCs w:val="22"/>
         </w:rPr>
-        <w:t xml:space="preserve">Ainda logado, abra o menu e escolha excluir minha conta. Confirme quando for pedido.</w:t>
+        <w:t xml:space="preserve">Ainda com a conta A, abra o menu e escolha Excluir minha conta. Confirme a primeira pergunta e digite EXCLUIR na segunda. Depois entre de novo com o mesmo email, deixando em branco o campo de nome de exibição.</w:t>
       </w:r>
     </w:p>
     <w:p>
@@ -1979,7 +1979,7 @@
           <w:sz w:val="22"/>
           <w:szCs w:val="22"/>
         </w:rPr>
-        <w:t xml:space="preserve">A sessão é encerrada e os dados são apagados. Entrando de novo com o mesmo email, o progresso anterior não deve voltar e o apelido antigo não deve aparecer no ranking.</w:t>
+        <w:t xml:space="preserve">A sessão termina na hora e a conta deixa de existir, com login, email, apelido, progresso e histórico de Pomodoros. O progresso que estava na tela continua neste navegador, agora sem dono. Ao entrar de novo com o mesmo email, a conta nasce outra vez, vazia, e o navegador pergunta se quer juntar o progresso que ficou nele. Escolha Cancelar: a conta começa do zero, com 3 de energia e progresso 0 de 8, e o apelido antigo não aparece mais no ranking. O teste T30 confere a exclusão pelo painel.</w:t>
       </w:r>
     </w:p>
     <w:p>
@@ -1994,7 +1994,175 @@
           <w:sz w:val="23"/>
           <w:szCs w:val="23"/>
         </w:rPr>
-        <w:t xml:space="preserve">T20. Política de privacidade e termos</w:t>
+        <w:t xml:space="preserve">T20. Troca de conta no mesmo navegador</w:t>
+      </w:r>
+    </w:p>
+    <w:p>
+      <w:pPr>
+        <w:spacing w:after="60" w:before="60"/>
+      </w:pPr>
+      <w:r>
+        <w:rPr>
+          <w:rFonts w:ascii="Arial" w:cs="Arial" w:eastAsia="Arial" w:hAnsi="Arial"/>
+          <w:b/>
+          <w:bCs/>
+          <w:sz w:val="22"/>
+          <w:szCs w:val="22"/>
+        </w:rPr>
+        <w:t xml:space="preserve">O que valida: </w:t>
+      </w:r>
+      <w:r>
+        <w:rPr>
+          <w:rFonts w:ascii="Arial" w:cs="Arial" w:eastAsia="Arial" w:hAnsi="Arial"/>
+          <w:sz w:val="22"/>
+          <w:szCs w:val="22"/>
+        </w:rPr>
+        <w:t xml:space="preserve">Se o progresso de uma conta fica separado do de outra, no banco e no mesmo navegador.</w:t>
+      </w:r>
+    </w:p>
+    <w:p>
+      <w:pPr>
+        <w:spacing w:after="60" w:before="60"/>
+      </w:pPr>
+      <w:r>
+        <w:rPr>
+          <w:rFonts w:ascii="Arial" w:cs="Arial" w:eastAsia="Arial" w:hAnsi="Arial"/>
+          <w:b/>
+          <w:bCs/>
+          <w:sz w:val="22"/>
+          <w:szCs w:val="22"/>
+        </w:rPr>
+        <w:t xml:space="preserve">Como fazer: </w:t>
+      </w:r>
+      <w:r>
+        <w:rPr>
+          <w:rFonts w:ascii="Arial" w:cs="Arial" w:eastAsia="Arial" w:hAnsi="Arial"/>
+          <w:sz w:val="22"/>
+          <w:szCs w:val="22"/>
+        </w:rPr>
+        <w:t xml:space="preserve">Com a conta A, conclua a missão 1 e repare no recorde que o minigame mostra ao terminar. Saia da conta. No mesmo navegador, entre com a conta B. Confira os indicadores do topo e comece o minigame da missão 1 só para ver o placar, saindo dele com Esc. Depois saia da conta B e entre de novo com a conta A.</w:t>
+      </w:r>
+    </w:p>
+    <w:p>
+      <w:pPr>
+        <w:spacing w:after="120" w:before="60"/>
+      </w:pPr>
+      <w:r>
+        <w:rPr>
+          <w:rFonts w:ascii="Arial" w:cs="Arial" w:eastAsia="Arial" w:hAnsi="Arial"/>
+          <w:b/>
+          <w:bCs/>
+          <w:sz w:val="22"/>
+          <w:szCs w:val="22"/>
+        </w:rPr>
+        <w:t xml:space="preserve">Resultado esperado: </w:t>
+      </w:r>
+      <w:r>
+        <w:rPr>
+          <w:rFonts w:ascii="Arial" w:cs="Arial" w:eastAsia="Arial" w:hAnsi="Arial"/>
+          <w:sz w:val="22"/>
+          <w:szCs w:val="22"/>
+        </w:rPr>
+        <w:t xml:space="preserve">Ao sair da conta A, aparece o aviso “Você saiu. Seu progresso está salvo na sua conta.” e o jogo volta ao começo. A conta B começa com 3 de energia, 0 moedas e progresso 0 de 8, e o placar do minigame não mostra o recorde da conta A. Ao voltar, a conta A recupera da nuvem o próprio progresso. O ranking mostra as duas contas, porque é público por natureza, mas nenhuma vê o email ou o progresso detalhado da outra.</w:t>
+      </w:r>
+    </w:p>
+    <w:p>
+      <w:pPr>
+        <w:spacing w:after="80" w:before="240"/>
+      </w:pPr>
+      <w:r>
+        <w:rPr>
+          <w:rFonts w:ascii="Arial" w:cs="Arial" w:eastAsia="Arial" w:hAnsi="Arial"/>
+          <w:b/>
+          <w:bCs/>
+          <w:sz w:val="23"/>
+          <w:szCs w:val="23"/>
+        </w:rPr>
+        <w:t xml:space="preserve">T21. Progresso jogado sem conta</w:t>
+      </w:r>
+    </w:p>
+    <w:p>
+      <w:pPr>
+        <w:spacing w:after="60" w:before="60"/>
+      </w:pPr>
+      <w:r>
+        <w:rPr>
+          <w:rFonts w:ascii="Arial" w:cs="Arial" w:eastAsia="Arial" w:hAnsi="Arial"/>
+          <w:b/>
+          <w:bCs/>
+          <w:sz w:val="22"/>
+          <w:szCs w:val="22"/>
+        </w:rPr>
+        <w:t xml:space="preserve">O que valida: </w:t>
+      </w:r>
+      <w:r>
+        <w:rPr>
+          <w:rFonts w:ascii="Arial" w:cs="Arial" w:eastAsia="Arial" w:hAnsi="Arial"/>
+          <w:sz w:val="22"/>
+          <w:szCs w:val="22"/>
+        </w:rPr>
+        <w:t xml:space="preserve">Se o progresso de quem jogou sem entrar numa conta só passa para uma conta com confirmação, o que protege quem usa computador compartilhado.</w:t>
+      </w:r>
+    </w:p>
+    <w:p>
+      <w:pPr>
+        <w:spacing w:after="60" w:before="60"/>
+      </w:pPr>
+      <w:r>
+        <w:rPr>
+          <w:rFonts w:ascii="Arial" w:cs="Arial" w:eastAsia="Arial" w:hAnsi="Arial"/>
+          <w:b/>
+          <w:bCs/>
+          <w:sz w:val="22"/>
+          <w:szCs w:val="22"/>
+        </w:rPr>
+        <w:t xml:space="preserve">Como fazer: </w:t>
+      </w:r>
+      <w:r>
+        <w:rPr>
+          <w:rFonts w:ascii="Arial" w:cs="Arial" w:eastAsia="Arial" w:hAnsi="Arial"/>
+          <w:sz w:val="22"/>
+          <w:szCs w:val="22"/>
+        </w:rPr>
+        <w:t xml:space="preserve">Saia da conta A e, sem entrar em nenhuma, conclua a missão 1. Entre com a conta B e, na pergunta que aparecer, escolha Cancelar. Saia, conclua a missão 1 de novo sem conta e entre com a conta B outra vez, agora escolhendo OK. Por fim, saia, conclua a missão 1 mais uma vez sem conta e entre com a conta B.</w:t>
+      </w:r>
+    </w:p>
+    <w:p>
+      <w:pPr>
+        <w:spacing w:after="120" w:before="60"/>
+      </w:pPr>
+      <w:r>
+        <w:rPr>
+          <w:rFonts w:ascii="Arial" w:cs="Arial" w:eastAsia="Arial" w:hAnsi="Arial"/>
+          <w:b/>
+          <w:bCs/>
+          <w:sz w:val="22"/>
+          <w:szCs w:val="22"/>
+        </w:rPr>
+        <w:t xml:space="preserve">Resultado esperado: </w:t>
+      </w:r>
+      <w:r>
+        <w:rPr>
+          <w:rFonts w:ascii="Arial" w:cs="Arial" w:eastAsia="Arial" w:hAnsi="Arial"/>
+          <w:sz w:val="22"/>
+          <w:szCs w:val="22"/>
+        </w:rPr>
+        <w:t xml:space="preserve">Na primeira entrada aparece a pergunta “Este navegador tem progresso que não está em nenhuma conta: X missões e Y moedas. Quer juntar esse progresso à sua conta?”, com os números do que foi jogado. Com Cancelar, esse progresso é descartado e a conta B fica só com o que já era dela. Com OK, a missão passa a contar para a conta B. Na última entrada nada é perguntado, porque a conta B já tem tanto quanto o navegador.</w:t>
+      </w:r>
+    </w:p>
+    <w:p>
+      <w:pPr>
+        <w:spacing w:after="80" w:before="240"/>
+      </w:pPr>
+      <w:r>
+        <w:rPr>
+          <w:rFonts w:ascii="Arial" w:cs="Arial" w:eastAsia="Arial" w:hAnsi="Arial"/>
+          <w:b/>
+          <w:bCs/>
+          <w:sz w:val="23"/>
+          <w:szCs w:val="23"/>
+        </w:rPr>
+        <w:t xml:space="preserve">T22. Política de privacidade e termos</w:t>
       </w:r>
     </w:p>
     <w:p>
@@ -2095,7 +2263,7 @@
           <w:sz w:val="23"/>
           <w:szCs w:val="23"/>
         </w:rPr>
-        <w:t xml:space="preserve">T21. Uso no celular</w:t>
+        <w:t xml:space="preserve">T23. Uso no celular</w:t>
       </w:r>
     </w:p>
     <w:p>
@@ -2179,7 +2347,7 @@
           <w:sz w:val="23"/>
           <w:szCs w:val="23"/>
         </w:rPr>
-        <w:t xml:space="preserve">T22. Navegação por teclado</w:t>
+        <w:t xml:space="preserve">T24. Navegação por teclado nas janelas</w:t>
       </w:r>
     </w:p>
     <w:p>
@@ -2202,7 +2370,7 @@
           <w:sz w:val="22"/>
           <w:szCs w:val="22"/>
         </w:rPr>
-        <w:t xml:space="preserve">Se quem não usa mouse consegue percorrer a interface.</w:t>
+        <w:t xml:space="preserve">Se quem não usa mouse consegue abrir, percorrer e fechar as janelas.</w:t>
       </w:r>
     </w:p>
     <w:p>
@@ -2225,7 +2393,7 @@
           <w:sz w:val="22"/>
           <w:szCs w:val="22"/>
         </w:rPr>
-        <w:t xml:space="preserve">No computador, percorra a página usando apenas a tecla Tab e acione com Enter.</w:t>
+        <w:t xml:space="preserve">No computador, use só o teclado. Com Tab, chegue ao botão do menu e abra com Enter. Percorra as opções com Tab até passar da última, feche com Esc e veja onde o foco fica. Repita com a janela de conquistas.</w:t>
       </w:r>
     </w:p>
     <w:p>
@@ -2248,7 +2416,7 @@
           <w:sz w:val="22"/>
           <w:szCs w:val="22"/>
         </w:rPr>
-        <w:t xml:space="preserve">O elemento em foco fica sempre visível com um contorno claro. É possível abrir o menu, percorrer as opções e fechar as janelas sem tocar no mouse.</w:t>
+        <w:t xml:space="preserve">O elemento em foco fica sempre visível com um contorno claro. Ao abrir, a janela recebe o foco, e o Tab circula só dentro dela, voltando ao primeiro item depois do último. O Esc fecha a janela e o foco volta para o botão que a abriu. Com a janela fechada, o Tab não passa por nenhum item dela, e um leitor de tela, se houver, não a lê.</w:t>
       </w:r>
     </w:p>
     <w:p>
@@ -2263,7 +2431,7 @@
           <w:sz w:val="23"/>
           <w:szCs w:val="23"/>
         </w:rPr>
-        <w:t xml:space="preserve">T23. Redução de movimento</w:t>
+        <w:t xml:space="preserve">T25. Globo, quizzes e minigames pelo teclado</w:t>
       </w:r>
     </w:p>
     <w:p>
@@ -2286,7 +2454,7 @@
           <w:sz w:val="22"/>
           <w:szCs w:val="22"/>
         </w:rPr>
-        <w:t xml:space="preserve">Se a plataforma respeita a preferência de acessibilidade do sistema operacional.</w:t>
+        <w:t xml:space="preserve">Se o jogo pode ser usado sem mouse fora das janelas, e onde ainda não pode.</w:t>
       </w:r>
     </w:p>
     <w:p>
@@ -2309,7 +2477,7 @@
           <w:sz w:val="22"/>
           <w:szCs w:val="22"/>
         </w:rPr>
-        <w:t xml:space="preserve">Ative a opção de reduzir animações nas configurações do seu sistema e recarregue o site.</w:t>
+        <w:t xml:space="preserve">Abra https://ecoverse.dev/?dev=free, que libera todas as missões sem salvar nada. Com Tab, percorra os marcadores do globo e abra uma missão com Enter ou espaço. Abra os quizzes e acione um quiz liberado com Tab e Enter. Inicie os minigames das missões 5 e 6 e jogue só com o teclado. Depois abra um dos outros minigames.</w:t>
       </w:r>
     </w:p>
     <w:p>
@@ -2332,7 +2500,7 @@
           <w:sz w:val="22"/>
           <w:szCs w:val="22"/>
         </w:rPr>
-        <w:t xml:space="preserve">As animações de interface ficam bem mais discretas ou desaparecem. O jogo continua utilizável.</w:t>
+        <w:t xml:space="preserve">Os marcadores da face visível do globo recebem o foco e abrem a missão com Enter ou espaço, e os quizzes liberados também funcionam assim. Os minigames das missões 5 e 6 podem ser jogados só com o teclado. Os das missões 1, 2, 3, 4, 7 e 8 ainda não têm controle por teclado: é uma limitação conhecida, registrada no documento de transferência, e não conta como falha.</w:t>
       </w:r>
     </w:p>
     <w:p>
@@ -2347,7 +2515,7 @@
           <w:sz w:val="23"/>
           <w:szCs w:val="23"/>
         </w:rPr>
-        <w:t xml:space="preserve">T24. Funcionamento sem internet</w:t>
+        <w:t xml:space="preserve">T26. Redução de movimento</w:t>
       </w:r>
     </w:p>
     <w:p>
@@ -2370,7 +2538,7 @@
           <w:sz w:val="22"/>
           <w:szCs w:val="22"/>
         </w:rPr>
-        <w:t xml:space="preserve">Se a instalação como aplicativo e o cache offline estão ativos.</w:t>
+        <w:t xml:space="preserve">Se a plataforma respeita a preferência de acessibilidade do sistema operacional.</w:t>
       </w:r>
     </w:p>
     <w:p>
@@ -2393,7 +2561,7 @@
           <w:sz w:val="22"/>
           <w:szCs w:val="22"/>
         </w:rPr>
-        <w:t xml:space="preserve">Depois de já ter aberto o site pelo menos uma vez, ative o modo avião e recarregue a página.</w:t>
+        <w:t xml:space="preserve">Ative a opção de reduzir animações nas configurações do seu sistema e recarregue o site.</w:t>
       </w:r>
     </w:p>
     <w:p>
@@ -2416,7 +2584,91 @@
           <w:sz w:val="22"/>
           <w:szCs w:val="22"/>
         </w:rPr>
-        <w:t xml:space="preserve">A interface básica ainda carrega a partir do cache. Recursos que dependem da nuvem, como o ranking, ficam indisponíveis, o que é esperado.</w:t>
+        <w:t xml:space="preserve">As animações de interface ficam bem mais discretas ou desaparecem. O jogo continua utilizável.</w:t>
+      </w:r>
+    </w:p>
+    <w:p>
+      <w:pPr>
+        <w:spacing w:after="80" w:before="240"/>
+      </w:pPr>
+      <w:r>
+        <w:rPr>
+          <w:rFonts w:ascii="Arial" w:cs="Arial" w:eastAsia="Arial" w:hAnsi="Arial"/>
+          <w:b/>
+          <w:bCs/>
+          <w:sz w:val="23"/>
+          <w:szCs w:val="23"/>
+        </w:rPr>
+        <w:t xml:space="preserve">T27. Funcionamento sem internet</w:t>
+      </w:r>
+    </w:p>
+    <w:p>
+      <w:pPr>
+        <w:spacing w:after="60" w:before="60"/>
+      </w:pPr>
+      <w:r>
+        <w:rPr>
+          <w:rFonts w:ascii="Arial" w:cs="Arial" w:eastAsia="Arial" w:hAnsi="Arial"/>
+          <w:b/>
+          <w:bCs/>
+          <w:sz w:val="22"/>
+          <w:szCs w:val="22"/>
+        </w:rPr>
+        <w:t xml:space="preserve">O que valida: </w:t>
+      </w:r>
+      <w:r>
+        <w:rPr>
+          <w:rFonts w:ascii="Arial" w:cs="Arial" w:eastAsia="Arial" w:hAnsi="Arial"/>
+          <w:sz w:val="22"/>
+          <w:szCs w:val="22"/>
+        </w:rPr>
+        <w:t xml:space="preserve">Se o cache offline está ativo, para o site abrir sem internet depois da primeira visita.</w:t>
+      </w:r>
+    </w:p>
+    <w:p>
+      <w:pPr>
+        <w:spacing w:after="60" w:before="60"/>
+      </w:pPr>
+      <w:r>
+        <w:rPr>
+          <w:rFonts w:ascii="Arial" w:cs="Arial" w:eastAsia="Arial" w:hAnsi="Arial"/>
+          <w:b/>
+          <w:bCs/>
+          <w:sz w:val="22"/>
+          <w:szCs w:val="22"/>
+        </w:rPr>
+        <w:t xml:space="preserve">Como fazer: </w:t>
+      </w:r>
+      <w:r>
+        <w:rPr>
+          <w:rFonts w:ascii="Arial" w:cs="Arial" w:eastAsia="Arial" w:hAnsi="Arial"/>
+          <w:sz w:val="22"/>
+          <w:szCs w:val="22"/>
+        </w:rPr>
+        <w:t xml:space="preserve">Com internet, abra https://ecoverse.dev e espere o globo aparecer por completo. Sem fechar a janela, ative o modo avião e recarregue a página.</w:t>
+      </w:r>
+    </w:p>
+    <w:p>
+      <w:pPr>
+        <w:spacing w:after="120" w:before="60"/>
+      </w:pPr>
+      <w:r>
+        <w:rPr>
+          <w:rFonts w:ascii="Arial" w:cs="Arial" w:eastAsia="Arial" w:hAnsi="Arial"/>
+          <w:b/>
+          <w:bCs/>
+          <w:sz w:val="22"/>
+          <w:szCs w:val="22"/>
+        </w:rPr>
+        <w:t xml:space="preserve">Resultado esperado: </w:t>
+      </w:r>
+      <w:r>
+        <w:rPr>
+          <w:rFonts w:ascii="Arial" w:cs="Arial" w:eastAsia="Arial" w:hAnsi="Arial"/>
+          <w:sz w:val="22"/>
+          <w:szCs w:val="22"/>
+        </w:rPr>
+        <w:t xml:space="preserve">O site abre a partir do que ficou guardado, com o globo e o progresso salvo neste navegador, e as missões podem ser jogadas. Login, ranking e sincronização ficam indisponíveis, o que é esperado.</w:t>
       </w:r>
     </w:p>
     <w:p>
@@ -2446,7 +2698,7 @@
           <w:sz w:val="22"/>
           <w:szCs w:val="22"/>
         </w:rPr>
-        <w:t xml:space="preserve">Esta parte exige acesso aos painéis administrativos. Deve ser feita por quem vai assumir a manutenção.</w:t>
+        <w:t xml:space="preserve">Esta parte exige acesso aos painéis administrativos do Supabase, da Vercel e do GitHub. Deve ser feita por quem vai assumir a manutenção.</w:t>
       </w:r>
     </w:p>
     <w:p>
@@ -2461,7 +2713,7 @@
           <w:sz w:val="23"/>
           <w:szCs w:val="23"/>
         </w:rPr>
-        <w:t xml:space="preserve">T25. Banco ativo</w:t>
+        <w:t xml:space="preserve">T28. Banco ativo</w:t>
       </w:r>
     </w:p>
     <w:p>
@@ -2545,7 +2797,7 @@
           <w:sz w:val="23"/>
           <w:szCs w:val="23"/>
         </w:rPr>
-        <w:t xml:space="preserve">T26. Rotina que mantém o banco acordado</w:t>
+        <w:t xml:space="preserve">T29. Rotina que mantém o banco acordado</w:t>
       </w:r>
     </w:p>
     <w:p>
@@ -2591,7 +2843,7 @@
           <w:sz w:val="22"/>
           <w:szCs w:val="22"/>
         </w:rPr>
-        <w:t xml:space="preserve">No painel da Vercel, abra a aba de tarefas agendadas e confirme que existe uma execução diária. No GitHub, abra a aba Actions e confirme que o fluxo keep-supabase-warm está habilitado e com execuções recentes bem sucedidas.</w:t>
+        <w:t xml:space="preserve">No painel da Vercel, abra as tarefas agendadas do projeto, em Settings → Cron Jobs, e confirme que existe uma execução diária. No GitHub, abra a aba Actions e confirme que o fluxo keep-supabase-warm está habilitado e com execuções recentes bem sucedidas. Por fim, abra https://ecoverse.dev/api/keep-alive no navegador.</w:t>
       </w:r>
     </w:p>
     <w:p>
@@ -2614,7 +2866,7 @@
           <w:sz w:val="22"/>
           <w:szCs w:val="22"/>
         </w:rPr>
-        <w:t xml:space="preserve">As duas camadas aparecem ativas. Se o fluxo do GitHub estiver desabilitado por inatividade do repositório, basta reabilitá-lo pelo botão da própria tela. Isso é comportamento normal da plataforma quando o repositório fica muito tempo sem receber commits.</w:t>
+        <w:t xml:space="preserve">As duas camadas aparecem ativas. A da Vercel roda uma vez por dia entre 08:00 e 08:59 UTC, e a do GitHub às 08:23 UTC. O endereço /api/keep-alive responde {"ok":false,"erro":"nao autorizado"}, sinal de que a variável CRON_SECRET está cadastrada; se responder {"ok":true}, ela sumiu da Vercel. Se o fluxo do GitHub estiver desabilitado por inatividade do repositório, basta reabilitá-lo pelo botão da própria tela. Isso é comportamento normal da plataforma quando o repositório fica muito tempo sem receber commits.</w:t>
       </w:r>
     </w:p>
     <w:p>
@@ -2629,7 +2881,7 @@
           <w:sz w:val="23"/>
           <w:szCs w:val="23"/>
         </w:rPr>
-        <w:t xml:space="preserve">T27. Isolamento entre contas</w:t>
+        <w:t xml:space="preserve">T30. Exclusão confirmada no banco</w:t>
       </w:r>
     </w:p>
     <w:p>
@@ -2652,7 +2904,7 @@
           <w:sz w:val="22"/>
           <w:szCs w:val="22"/>
         </w:rPr>
-        <w:t xml:space="preserve">Se as regras de segurança do banco impedem que um usuário leia dados de outro.</w:t>
+        <w:t xml:space="preserve">Se a exclusão do T19 apagou a conta inteira no banco, e se só quem está logado pode pedir uma exclusão.</w:t>
       </w:r>
     </w:p>
     <w:p>
@@ -2675,7 +2927,7 @@
           <w:sz w:val="22"/>
           <w:szCs w:val="22"/>
         </w:rPr>
-        <w:t xml:space="preserve">Crie duas contas com emails diferentes. Em cada uma, conclua missões distintas.</w:t>
+        <w:t xml:space="preserve">Abra o arquivo JSON guardado no T18 e copie o identificador da conta, no campo account.id. No painel do Supabase, procure esse identificador em Authentication → Users e, no Table Editor, filtre as tabelas profiles, progress e pomodoro_sessions por ele (coluna id em profiles e user_id nas outras duas). Depois, no SQL Editor, rode select has_function_privilege('anon', 'public.delete_own_account()', 'execute');</w:t>
       </w:r>
     </w:p>
     <w:p>
@@ -2698,7 +2950,175 @@
           <w:sz w:val="22"/>
           <w:szCs w:val="22"/>
         </w:rPr>
-        <w:t xml:space="preserve">Cada conta enxerga apenas o próprio progresso. O ranking mostra as duas, porque ele é público por natureza, mas nenhuma conta consegue ver o email ou o progresso detalhado da outra.</w:t>
+        <w:t xml:space="preserve">Nada é encontrado nos quatro lugares. A conta criada de novo no fim do T19, com o mesmo email, aparece em Users com outro identificador. A consulta responde false: quem não está logado não consegue pedir exclusão.</w:t>
+      </w:r>
+    </w:p>
+    <w:p>
+      <w:pPr>
+        <w:spacing w:after="80" w:before="240"/>
+      </w:pPr>
+      <w:r>
+        <w:rPr>
+          <w:rFonts w:ascii="Arial" w:cs="Arial" w:eastAsia="Arial" w:hAnsi="Arial"/>
+          <w:b/>
+          <w:bCs/>
+          <w:sz w:val="23"/>
+          <w:szCs w:val="23"/>
+        </w:rPr>
+        <w:t xml:space="preserve">T31. Domínio e certificado</w:t>
+      </w:r>
+    </w:p>
+    <w:p>
+      <w:pPr>
+        <w:spacing w:after="60" w:before="60"/>
+      </w:pPr>
+      <w:r>
+        <w:rPr>
+          <w:rFonts w:ascii="Arial" w:cs="Arial" w:eastAsia="Arial" w:hAnsi="Arial"/>
+          <w:b/>
+          <w:bCs/>
+          <w:sz w:val="22"/>
+          <w:szCs w:val="22"/>
+        </w:rPr>
+        <w:t xml:space="preserve">O que valida: </w:t>
+      </w:r>
+      <w:r>
+        <w:rPr>
+          <w:rFonts w:ascii="Arial" w:cs="Arial" w:eastAsia="Arial" w:hAnsi="Arial"/>
+          <w:sz w:val="22"/>
+          <w:szCs w:val="22"/>
+        </w:rPr>
+        <w:t xml:space="preserve">Se o domínio está ativo, com certificado válido e os redirecionamentos certos.</w:t>
+      </w:r>
+    </w:p>
+    <w:p>
+      <w:pPr>
+        <w:spacing w:after="60" w:before="60"/>
+      </w:pPr>
+      <w:r>
+        <w:rPr>
+          <w:rFonts w:ascii="Arial" w:cs="Arial" w:eastAsia="Arial" w:hAnsi="Arial"/>
+          <w:b/>
+          <w:bCs/>
+          <w:sz w:val="22"/>
+          <w:szCs w:val="22"/>
+        </w:rPr>
+        <w:t xml:space="preserve">Como fazer: </w:t>
+      </w:r>
+      <w:r>
+        <w:rPr>
+          <w:rFonts w:ascii="Arial" w:cs="Arial" w:eastAsia="Arial" w:hAnsi="Arial"/>
+          <w:sz w:val="22"/>
+          <w:szCs w:val="22"/>
+        </w:rPr>
+        <w:t xml:space="preserve">Abra https://www.ecoverse.dev e depois http://ecoverse.dev, sem o s. No painel da Vercel, em Domains, abra o domínio ecoverse.dev.</w:t>
+      </w:r>
+    </w:p>
+    <w:p>
+      <w:pPr>
+        <w:spacing w:after="120" w:before="60"/>
+      </w:pPr>
+      <w:r>
+        <w:rPr>
+          <w:rFonts w:ascii="Arial" w:cs="Arial" w:eastAsia="Arial" w:hAnsi="Arial"/>
+          <w:b/>
+          <w:bCs/>
+          <w:sz w:val="22"/>
+          <w:szCs w:val="22"/>
+        </w:rPr>
+        <w:t xml:space="preserve">Resultado esperado: </w:t>
+      </w:r>
+      <w:r>
+        <w:rPr>
+          <w:rFonts w:ascii="Arial" w:cs="Arial" w:eastAsia="Arial" w:hAnsi="Arial"/>
+          <w:sz w:val="22"/>
+          <w:szCs w:val="22"/>
+        </w:rPr>
+        <w:t xml:space="preserve">Os dois endereços terminam em https://ecoverse.dev, com o cadeado de segurança. O painel mostra o domínio válido, com vencimento em 14/05/2027. Confira se a renovação automática está ligada e se a conta tem forma de pagamento válida.</w:t>
+      </w:r>
+    </w:p>
+    <w:p>
+      <w:pPr>
+        <w:spacing w:after="80" w:before="240"/>
+      </w:pPr>
+      <w:r>
+        <w:rPr>
+          <w:rFonts w:ascii="Arial" w:cs="Arial" w:eastAsia="Arial" w:hAnsi="Arial"/>
+          <w:b/>
+          <w:bCs/>
+          <w:sz w:val="23"/>
+          <w:szCs w:val="23"/>
+        </w:rPr>
+        <w:t xml:space="preserve">T32. Proteções do repositório</w:t>
+      </w:r>
+    </w:p>
+    <w:p>
+      <w:pPr>
+        <w:spacing w:after="60" w:before="60"/>
+      </w:pPr>
+      <w:r>
+        <w:rPr>
+          <w:rFonts w:ascii="Arial" w:cs="Arial" w:eastAsia="Arial" w:hAnsi="Arial"/>
+          <w:b/>
+          <w:bCs/>
+          <w:sz w:val="22"/>
+          <w:szCs w:val="22"/>
+        </w:rPr>
+        <w:t xml:space="preserve">O que valida: </w:t>
+      </w:r>
+      <w:r>
+        <w:rPr>
+          <w:rFonts w:ascii="Arial" w:cs="Arial" w:eastAsia="Arial" w:hAnsi="Arial"/>
+          <w:sz w:val="22"/>
+          <w:szCs w:val="22"/>
+        </w:rPr>
+        <w:t xml:space="preserve">Se continuam ativas as regras que protegem a main, as versões e o registro no INPI, e se a aba de segurança está em dia.</w:t>
+      </w:r>
+    </w:p>
+    <w:p>
+      <w:pPr>
+        <w:spacing w:after="60" w:before="60"/>
+      </w:pPr>
+      <w:r>
+        <w:rPr>
+          <w:rFonts w:ascii="Arial" w:cs="Arial" w:eastAsia="Arial" w:hAnsi="Arial"/>
+          <w:b/>
+          <w:bCs/>
+          <w:sz w:val="22"/>
+          <w:szCs w:val="22"/>
+        </w:rPr>
+        <w:t xml:space="preserve">Como fazer: </w:t>
+      </w:r>
+      <w:r>
+        <w:rPr>
+          <w:rFonts w:ascii="Arial" w:cs="Arial" w:eastAsia="Arial" w:hAnsi="Arial"/>
+          <w:sz w:val="22"/>
+          <w:szCs w:val="22"/>
+        </w:rPr>
+        <w:t xml:space="preserve">No GitHub, abra Settings → Rules → Rulesets, depois a lista de tags, a página de releases e a aba Security.</w:t>
+      </w:r>
+    </w:p>
+    <w:p>
+      <w:pPr>
+        <w:spacing w:after="120" w:before="60"/>
+      </w:pPr>
+      <w:r>
+        <w:rPr>
+          <w:rFonts w:ascii="Arial" w:cs="Arial" w:eastAsia="Arial" w:hAnsi="Arial"/>
+          <w:b/>
+          <w:bCs/>
+          <w:sz w:val="22"/>
+          <w:szCs w:val="22"/>
+        </w:rPr>
+        <w:t xml:space="preserve">Resultado esperado: </w:t>
+      </w:r>
+      <w:r>
+        <w:rPr>
+          <w:rFonts w:ascii="Arial" w:cs="Arial" w:eastAsia="Arial" w:hAnsi="Arial"/>
+          <w:sz w:val="22"/>
+          <w:szCs w:val="22"/>
+        </w:rPr>
+        <w:t xml:space="preserve">Os rulesets main protegida e versões imutáveis aparecem ativos. As tags de versão e a tag inpi-2026-09-22 estão lá, e uma release aparece marcada como Latest. A aba Security mostra o CodeQL com análise recente e nenhum alerta aberto esquecido.</w:t>
       </w:r>
     </w:p>
     <w:p>
@@ -2761,15 +3181,15 @@
           <w:sz w:val="22"/>
           <w:szCs w:val="22"/>
         </w:rPr>
-        <w:t xml:space="preserve">Nenhum login funciona e o site não carrega dados. </w:t>
-      </w:r>
-      <w:r>
-        <w:rPr>
-          <w:rFonts w:ascii="Arial" w:cs="Arial" w:eastAsia="Arial" w:hAnsi="Arial"/>
-          <w:sz w:val="22"/>
-          <w:szCs w:val="22"/>
-        </w:rPr>
-        <w:t xml:space="preserve">O projeto Supabase provavelmente foi pausado por inatividade. Retome pelo painel. Veja o teste T25.</w:t>
+        <w:t xml:space="preserve">Nenhum login funciona e o ranking não carrega. </w:t>
+      </w:r>
+      <w:r>
+        <w:rPr>
+          <w:rFonts w:ascii="Arial" w:cs="Arial" w:eastAsia="Arial" w:hAnsi="Arial"/>
+          <w:sz w:val="22"/>
+          <w:szCs w:val="22"/>
+        </w:rPr>
+        <w:t xml:space="preserve">O projeto Supabase provavelmente foi pausado por inatividade; o jogo sem conta continua funcionando. Retome pelo painel. Veja o teste T28.</w:t>
       </w:r>
     </w:p>
     <w:p>
@@ -2797,7 +3217,7 @@
           <w:sz w:val="22"/>
           <w:szCs w:val="22"/>
         </w:rPr>
-        <w:t xml:space="preserve">Confira a caixa de spam e a lixeira. Se não estiver em nenhum dos dois, veja no painel do serviço de envio se a mensagem consta como entregue. O passo a passo está no manual do banco, no repositório.</w:t>
+        <w:t xml:space="preserve">Confira a caixa de spam e a lixeira. Se não estiver em nenhum dos dois, veja no painel do Resend se a mensagem consta como entregue e se a cota do dia acabou: o plano gratuito envia até 100 emails por dia, e o Supabase está configurado para até 100 por hora. O passo a passo está no manual do banco, no repositório.</w:t>
       </w:r>
     </w:p>
     <w:p>
@@ -2825,7 +3245,7 @@
           <w:sz w:val="22"/>
           <w:szCs w:val="22"/>
         </w:rPr>
-        <w:t xml:space="preserve">As permissões do banco podem ter sido alteradas. Basta rodar de novo o arquivo de políticas que está no repositório, em supabase/policies.sql.</w:t>
+        <w:t xml:space="preserve">As permissões do banco podem ter sido alteradas. Rode de novo supabase/schema.sql e depois supabase/policies.sql, no SQL Editor do Supabase. Os dois podem ser rodados mais de uma vez sem problema.</w:t>
       </w:r>
     </w:p>
     <w:p>
@@ -2854,6 +3274,34 @@
           <w:szCs w:val="22"/>
         </w:rPr>
         <w:t xml:space="preserve">Anote qual missão e qual modelo de aparelho. Isso é um ponto de melhoria já mapeado, descrito no documento de transferência.</w:t>
+      </w:r>
+    </w:p>
+    <w:p>
+      <w:pPr>
+        <w:pStyle w:val="ListParagraph"/>
+        <w:numPr>
+          <w:ilvl w:val="0"/>
+          <w:numId w:val="1"/>
+        </w:numPr>
+        <w:spacing w:after="80" w:before="60"/>
+      </w:pPr>
+      <w:r>
+        <w:rPr>
+          <w:rFonts w:ascii="Arial" w:cs="Arial" w:eastAsia="Arial" w:hAnsi="Arial"/>
+          <w:b/>
+          <w:bCs/>
+          <w:sz w:val="22"/>
+          <w:szCs w:val="22"/>
+        </w:rPr>
+        <w:t xml:space="preserve">Ao sair, o aviso diz que parte do progresso ficou no navegador. </w:t>
+      </w:r>
+      <w:r>
+        <w:rPr>
+          <w:rFonts w:ascii="Arial" w:cs="Arial" w:eastAsia="Arial" w:hAnsi="Arial"/>
+          <w:sz w:val="22"/>
+          <w:szCs w:val="22"/>
+        </w:rPr>
+        <w:t xml:space="preserve">A última gravação não chegou à nuvem, quase sempre por rede ruim. Não é falha: o progresso sobe quando a mesma conta entrar de novo nesse navegador.</w:t>
       </w:r>
     </w:p>
     <w:p>

</xml_diff>

<commit_message>
docs(entrega): transferência e bateria prontas para imprimir e entregar
Abertos no Word, os dois documentos tinham linhas de tabela e testes
partidos entre páginas, títulos sozinhos no pé da página e parágrafos
colados no fim das listas. Agora há rodapé com número de página, as
tabelas ocupam a largura do texto e cada teste fica numa página só. As
propriedades dos arquivos mostravam o autor "Un-named"; passam a ter
título, autor e idioma português, que a revisão ortográfica usa.

Na transferência, a situação foi conferida de novo e datada de 27/10.
Entram o fim do suporte do Node 22 (30/04/2027) e a revisão anual das
dependências. A rotina do GitHub está marcada para 08:23 UTC, mas em
outubro rodou entre 12:00 e 16:00 UTC, e os dois documentos agora dizem
isso. Na bateria, o T29 descreve a resposta real do keep-alive sem o
segredo. O T21 explica por que a pergunta de juntar pode aparecer quando
o navegador ganha uma conquista que a conta ainda não tem.
</commit_message>
<xml_diff>
--- a/docs/Ecoverse - Bateria de testes.docx
+++ b/docs/Ecoverse - Bateria de testes.docx
@@ -107,7 +107,7 @@
           <w:sz w:val="20"/>
           <w:szCs w:val="20"/>
         </w:rPr>
-        <w:t xml:space="preserve">Documento revisado em 26 de outubro de 2026</w:t>
+        <w:t xml:space="preserve">Documento revisado em 27 de outubro de 2026</w:t>
       </w:r>
     </w:p>
     <w:p>
@@ -226,7 +226,7 @@
           <w:ilvl w:val="0"/>
           <w:numId w:val="1"/>
         </w:numPr>
-        <w:spacing w:after="60" w:before="40"/>
+        <w:spacing w:after="140" w:before="40"/>
       </w:pPr>
       <w:r>
         <w:rPr>
@@ -328,6 +328,8 @@
     </w:p>
     <w:p>
       <w:pPr>
+        <w:keepNext/>
+        <w:keepLines/>
         <w:spacing w:after="80" w:before="240"/>
       </w:pPr>
       <w:r>
@@ -343,6 +345,8 @@
     </w:p>
     <w:p>
       <w:pPr>
+        <w:keepNext/>
+        <w:keepLines/>
         <w:spacing w:after="60" w:before="60"/>
       </w:pPr>
       <w:r>
@@ -366,6 +370,8 @@
     </w:p>
     <w:p>
       <w:pPr>
+        <w:keepNext/>
+        <w:keepLines/>
         <w:spacing w:after="60" w:before="60"/>
       </w:pPr>
       <w:r>
@@ -389,6 +395,7 @@
     </w:p>
     <w:p>
       <w:pPr>
+        <w:keepLines/>
         <w:spacing w:after="120" w:before="60"/>
       </w:pPr>
       <w:r>
@@ -412,6 +419,8 @@
     </w:p>
     <w:p>
       <w:pPr>
+        <w:keepNext/>
+        <w:keepLines/>
         <w:spacing w:after="80" w:before="240"/>
       </w:pPr>
       <w:r>
@@ -427,6 +436,8 @@
     </w:p>
     <w:p>
       <w:pPr>
+        <w:keepNext/>
+        <w:keepLines/>
         <w:spacing w:after="60" w:before="60"/>
       </w:pPr>
       <w:r>
@@ -450,6 +461,8 @@
     </w:p>
     <w:p>
       <w:pPr>
+        <w:keepNext/>
+        <w:keepLines/>
         <w:spacing w:after="60" w:before="60"/>
       </w:pPr>
       <w:r>
@@ -473,6 +486,7 @@
     </w:p>
     <w:p>
       <w:pPr>
+        <w:keepLines/>
         <w:spacing w:after="120" w:before="60"/>
       </w:pPr>
       <w:r>
@@ -496,6 +510,8 @@
     </w:p>
     <w:p>
       <w:pPr>
+        <w:keepNext/>
+        <w:keepLines/>
         <w:spacing w:after="80" w:before="240"/>
       </w:pPr>
       <w:r>
@@ -511,6 +527,8 @@
     </w:p>
     <w:p>
       <w:pPr>
+        <w:keepNext/>
+        <w:keepLines/>
         <w:spacing w:after="60" w:before="60"/>
       </w:pPr>
       <w:r>
@@ -534,6 +552,8 @@
     </w:p>
     <w:p>
       <w:pPr>
+        <w:keepNext/>
+        <w:keepLines/>
         <w:spacing w:after="60" w:before="60"/>
       </w:pPr>
       <w:r>
@@ -557,6 +577,7 @@
     </w:p>
     <w:p>
       <w:pPr>
+        <w:keepLines/>
         <w:spacing w:after="120" w:before="60"/>
       </w:pPr>
       <w:r>
@@ -580,6 +601,8 @@
     </w:p>
     <w:p>
       <w:pPr>
+        <w:keepNext/>
+        <w:keepLines/>
         <w:spacing w:after="80" w:before="240"/>
       </w:pPr>
       <w:r>
@@ -595,6 +618,8 @@
     </w:p>
     <w:p>
       <w:pPr>
+        <w:keepNext/>
+        <w:keepLines/>
         <w:spacing w:after="60" w:before="60"/>
       </w:pPr>
       <w:r>
@@ -618,6 +643,8 @@
     </w:p>
     <w:p>
       <w:pPr>
+        <w:keepNext/>
+        <w:keepLines/>
         <w:spacing w:after="60" w:before="60"/>
       </w:pPr>
       <w:r>
@@ -641,6 +668,7 @@
     </w:p>
     <w:p>
       <w:pPr>
+        <w:keepLines/>
         <w:spacing w:after="120" w:before="60"/>
       </w:pPr>
       <w:r>
@@ -664,6 +692,8 @@
     </w:p>
     <w:p>
       <w:pPr>
+        <w:keepNext/>
+        <w:keepLines/>
         <w:spacing w:after="80" w:before="240"/>
       </w:pPr>
       <w:r>
@@ -679,6 +709,8 @@
     </w:p>
     <w:p>
       <w:pPr>
+        <w:keepNext/>
+        <w:keepLines/>
         <w:spacing w:after="60" w:before="60"/>
       </w:pPr>
       <w:r>
@@ -702,6 +734,8 @@
     </w:p>
     <w:p>
       <w:pPr>
+        <w:keepNext/>
+        <w:keepLines/>
         <w:spacing w:after="60" w:before="60"/>
       </w:pPr>
       <w:r>
@@ -725,6 +759,7 @@
     </w:p>
     <w:p>
       <w:pPr>
+        <w:keepLines/>
         <w:spacing w:after="120" w:before="60"/>
       </w:pPr>
       <w:r>
@@ -748,6 +783,8 @@
     </w:p>
     <w:p>
       <w:pPr>
+        <w:keepNext/>
+        <w:keepLines/>
         <w:spacing w:after="80" w:before="240"/>
       </w:pPr>
       <w:r>
@@ -763,6 +800,8 @@
     </w:p>
     <w:p>
       <w:pPr>
+        <w:keepNext/>
+        <w:keepLines/>
         <w:spacing w:after="60" w:before="60"/>
       </w:pPr>
       <w:r>
@@ -786,6 +825,8 @@
     </w:p>
     <w:p>
       <w:pPr>
+        <w:keepNext/>
+        <w:keepLines/>
         <w:spacing w:after="60" w:before="60"/>
       </w:pPr>
       <w:r>
@@ -809,6 +850,7 @@
     </w:p>
     <w:p>
       <w:pPr>
+        <w:keepLines/>
         <w:spacing w:after="120" w:before="60"/>
       </w:pPr>
       <w:r>
@@ -832,6 +874,8 @@
     </w:p>
     <w:p>
       <w:pPr>
+        <w:keepNext/>
+        <w:keepLines/>
         <w:spacing w:after="80" w:before="240"/>
       </w:pPr>
       <w:r>
@@ -847,6 +891,8 @@
     </w:p>
     <w:p>
       <w:pPr>
+        <w:keepNext/>
+        <w:keepLines/>
         <w:spacing w:after="60" w:before="60"/>
       </w:pPr>
       <w:r>
@@ -870,6 +916,8 @@
     </w:p>
     <w:p>
       <w:pPr>
+        <w:keepNext/>
+        <w:keepLines/>
         <w:spacing w:after="60" w:before="60"/>
       </w:pPr>
       <w:r>
@@ -893,6 +941,7 @@
     </w:p>
     <w:p>
       <w:pPr>
+        <w:keepLines/>
         <w:spacing w:after="120" w:before="60"/>
       </w:pPr>
       <w:r>
@@ -916,6 +965,8 @@
     </w:p>
     <w:p>
       <w:pPr>
+        <w:keepNext/>
+        <w:keepLines/>
         <w:spacing w:after="80" w:before="240"/>
       </w:pPr>
       <w:r>
@@ -931,6 +982,8 @@
     </w:p>
     <w:p>
       <w:pPr>
+        <w:keepNext/>
+        <w:keepLines/>
         <w:spacing w:after="60" w:before="60"/>
       </w:pPr>
       <w:r>
@@ -954,6 +1007,8 @@
     </w:p>
     <w:p>
       <w:pPr>
+        <w:keepNext/>
+        <w:keepLines/>
         <w:spacing w:after="60" w:before="60"/>
       </w:pPr>
       <w:r>
@@ -977,6 +1032,7 @@
     </w:p>
     <w:p>
       <w:pPr>
+        <w:keepLines/>
         <w:spacing w:after="120" w:before="60"/>
       </w:pPr>
       <w:r>
@@ -1000,6 +1056,8 @@
     </w:p>
     <w:p>
       <w:pPr>
+        <w:keepNext/>
+        <w:keepLines/>
         <w:spacing w:after="80" w:before="240"/>
       </w:pPr>
       <w:r>
@@ -1015,6 +1073,8 @@
     </w:p>
     <w:p>
       <w:pPr>
+        <w:keepNext/>
+        <w:keepLines/>
         <w:spacing w:after="60" w:before="60"/>
       </w:pPr>
       <w:r>
@@ -1038,6 +1098,8 @@
     </w:p>
     <w:p>
       <w:pPr>
+        <w:keepNext/>
+        <w:keepLines/>
         <w:spacing w:after="60" w:before="60"/>
       </w:pPr>
       <w:r>
@@ -1061,6 +1123,7 @@
     </w:p>
     <w:p>
       <w:pPr>
+        <w:keepLines/>
         <w:spacing w:after="120" w:before="60"/>
       </w:pPr>
       <w:r>
@@ -1084,6 +1147,8 @@
     </w:p>
     <w:p>
       <w:pPr>
+        <w:keepNext/>
+        <w:keepLines/>
         <w:spacing w:after="80" w:before="240"/>
       </w:pPr>
       <w:r>
@@ -1099,6 +1164,8 @@
     </w:p>
     <w:p>
       <w:pPr>
+        <w:keepNext/>
+        <w:keepLines/>
         <w:spacing w:after="60" w:before="60"/>
       </w:pPr>
       <w:r>
@@ -1122,6 +1189,8 @@
     </w:p>
     <w:p>
       <w:pPr>
+        <w:keepNext/>
+        <w:keepLines/>
         <w:spacing w:after="60" w:before="60"/>
       </w:pPr>
       <w:r>
@@ -1145,6 +1214,7 @@
     </w:p>
     <w:p>
       <w:pPr>
+        <w:keepLines/>
         <w:spacing w:after="120" w:before="60"/>
       </w:pPr>
       <w:r>
@@ -1198,6 +1268,8 @@
     </w:p>
     <w:p>
       <w:pPr>
+        <w:keepNext/>
+        <w:keepLines/>
         <w:spacing w:after="80" w:before="240"/>
       </w:pPr>
       <w:r>
@@ -1213,6 +1285,8 @@
     </w:p>
     <w:p>
       <w:pPr>
+        <w:keepNext/>
+        <w:keepLines/>
         <w:spacing w:after="60" w:before="60"/>
       </w:pPr>
       <w:r>
@@ -1236,6 +1310,8 @@
     </w:p>
     <w:p>
       <w:pPr>
+        <w:keepNext/>
+        <w:keepLines/>
         <w:spacing w:after="60" w:before="60"/>
       </w:pPr>
       <w:r>
@@ -1259,6 +1335,7 @@
     </w:p>
     <w:p>
       <w:pPr>
+        <w:keepLines/>
         <w:spacing w:after="120" w:before="60"/>
       </w:pPr>
       <w:r>
@@ -1282,6 +1359,8 @@
     </w:p>
     <w:p>
       <w:pPr>
+        <w:keepNext/>
+        <w:keepLines/>
         <w:spacing w:after="80" w:before="240"/>
       </w:pPr>
       <w:r>
@@ -1297,6 +1376,8 @@
     </w:p>
     <w:p>
       <w:pPr>
+        <w:keepNext/>
+        <w:keepLines/>
         <w:spacing w:after="60" w:before="60"/>
       </w:pPr>
       <w:r>
@@ -1320,6 +1401,8 @@
     </w:p>
     <w:p>
       <w:pPr>
+        <w:keepNext/>
+        <w:keepLines/>
         <w:spacing w:after="60" w:before="60"/>
       </w:pPr>
       <w:r>
@@ -1343,6 +1426,7 @@
     </w:p>
     <w:p>
       <w:pPr>
+        <w:keepLines/>
         <w:spacing w:after="120" w:before="60"/>
       </w:pPr>
       <w:r>
@@ -1366,6 +1450,8 @@
     </w:p>
     <w:p>
       <w:pPr>
+        <w:keepNext/>
+        <w:keepLines/>
         <w:spacing w:after="80" w:before="240"/>
       </w:pPr>
       <w:r>
@@ -1381,6 +1467,8 @@
     </w:p>
     <w:p>
       <w:pPr>
+        <w:keepNext/>
+        <w:keepLines/>
         <w:spacing w:after="60" w:before="60"/>
       </w:pPr>
       <w:r>
@@ -1404,6 +1492,8 @@
     </w:p>
     <w:p>
       <w:pPr>
+        <w:keepNext/>
+        <w:keepLines/>
         <w:spacing w:after="60" w:before="60"/>
       </w:pPr>
       <w:r>
@@ -1427,6 +1517,7 @@
     </w:p>
     <w:p>
       <w:pPr>
+        <w:keepLines/>
         <w:spacing w:after="120" w:before="60"/>
       </w:pPr>
       <w:r>
@@ -1450,6 +1541,8 @@
     </w:p>
     <w:p>
       <w:pPr>
+        <w:keepNext/>
+        <w:keepLines/>
         <w:spacing w:after="80" w:before="240"/>
       </w:pPr>
       <w:r>
@@ -1465,6 +1558,8 @@
     </w:p>
     <w:p>
       <w:pPr>
+        <w:keepNext/>
+        <w:keepLines/>
         <w:spacing w:after="60" w:before="60"/>
       </w:pPr>
       <w:r>
@@ -1488,6 +1583,8 @@
     </w:p>
     <w:p>
       <w:pPr>
+        <w:keepNext/>
+        <w:keepLines/>
         <w:spacing w:after="60" w:before="60"/>
       </w:pPr>
       <w:r>
@@ -1511,6 +1608,7 @@
     </w:p>
     <w:p>
       <w:pPr>
+        <w:keepLines/>
         <w:spacing w:after="120" w:before="60"/>
       </w:pPr>
       <w:r>
@@ -1534,6 +1632,8 @@
     </w:p>
     <w:p>
       <w:pPr>
+        <w:keepNext/>
+        <w:keepLines/>
         <w:spacing w:after="80" w:before="240"/>
       </w:pPr>
       <w:r>
@@ -1549,6 +1649,8 @@
     </w:p>
     <w:p>
       <w:pPr>
+        <w:keepNext/>
+        <w:keepLines/>
         <w:spacing w:after="60" w:before="60"/>
       </w:pPr>
       <w:r>
@@ -1572,6 +1674,8 @@
     </w:p>
     <w:p>
       <w:pPr>
+        <w:keepNext/>
+        <w:keepLines/>
         <w:spacing w:after="60" w:before="60"/>
       </w:pPr>
       <w:r>
@@ -1595,6 +1699,7 @@
     </w:p>
     <w:p>
       <w:pPr>
+        <w:keepLines/>
         <w:spacing w:after="120" w:before="60"/>
       </w:pPr>
       <w:r>
@@ -1618,6 +1723,8 @@
     </w:p>
     <w:p>
       <w:pPr>
+        <w:keepNext/>
+        <w:keepLines/>
         <w:spacing w:after="80" w:before="240"/>
       </w:pPr>
       <w:r>
@@ -1633,6 +1740,8 @@
     </w:p>
     <w:p>
       <w:pPr>
+        <w:keepNext/>
+        <w:keepLines/>
         <w:spacing w:after="60" w:before="60"/>
       </w:pPr>
       <w:r>
@@ -1656,6 +1765,8 @@
     </w:p>
     <w:p>
       <w:pPr>
+        <w:keepNext/>
+        <w:keepLines/>
         <w:spacing w:after="60" w:before="60"/>
       </w:pPr>
       <w:r>
@@ -1679,6 +1790,7 @@
     </w:p>
     <w:p>
       <w:pPr>
+        <w:keepLines/>
         <w:spacing w:after="120" w:before="60"/>
       </w:pPr>
       <w:r>
@@ -1702,6 +1814,8 @@
     </w:p>
     <w:p>
       <w:pPr>
+        <w:keepNext/>
+        <w:keepLines/>
         <w:spacing w:after="80" w:before="240"/>
       </w:pPr>
       <w:r>
@@ -1717,6 +1831,8 @@
     </w:p>
     <w:p>
       <w:pPr>
+        <w:keepNext/>
+        <w:keepLines/>
         <w:spacing w:after="60" w:before="60"/>
       </w:pPr>
       <w:r>
@@ -1740,6 +1856,8 @@
     </w:p>
     <w:p>
       <w:pPr>
+        <w:keepNext/>
+        <w:keepLines/>
         <w:spacing w:after="60" w:before="60"/>
       </w:pPr>
       <w:r>
@@ -1763,6 +1881,7 @@
     </w:p>
     <w:p>
       <w:pPr>
+        <w:keepLines/>
         <w:spacing w:after="120" w:before="60"/>
       </w:pPr>
       <w:r>
@@ -1816,6 +1935,8 @@
     </w:p>
     <w:p>
       <w:pPr>
+        <w:keepNext/>
+        <w:keepLines/>
         <w:spacing w:after="80" w:before="240"/>
       </w:pPr>
       <w:r>
@@ -1831,6 +1952,8 @@
     </w:p>
     <w:p>
       <w:pPr>
+        <w:keepNext/>
+        <w:keepLines/>
         <w:spacing w:after="60" w:before="60"/>
       </w:pPr>
       <w:r>
@@ -1854,6 +1977,8 @@
     </w:p>
     <w:p>
       <w:pPr>
+        <w:keepNext/>
+        <w:keepLines/>
         <w:spacing w:after="60" w:before="60"/>
       </w:pPr>
       <w:r>
@@ -1877,6 +2002,7 @@
     </w:p>
     <w:p>
       <w:pPr>
+        <w:keepLines/>
         <w:spacing w:after="120" w:before="60"/>
       </w:pPr>
       <w:r>
@@ -1900,6 +2026,8 @@
     </w:p>
     <w:p>
       <w:pPr>
+        <w:keepNext/>
+        <w:keepLines/>
         <w:spacing w:after="80" w:before="240"/>
       </w:pPr>
       <w:r>
@@ -1915,6 +2043,8 @@
     </w:p>
     <w:p>
       <w:pPr>
+        <w:keepNext/>
+        <w:keepLines/>
         <w:spacing w:after="60" w:before="60"/>
       </w:pPr>
       <w:r>
@@ -1938,6 +2068,8 @@
     </w:p>
     <w:p>
       <w:pPr>
+        <w:keepNext/>
+        <w:keepLines/>
         <w:spacing w:after="60" w:before="60"/>
       </w:pPr>
       <w:r>
@@ -1961,6 +2093,7 @@
     </w:p>
     <w:p>
       <w:pPr>
+        <w:keepLines/>
         <w:spacing w:after="120" w:before="60"/>
       </w:pPr>
       <w:r>
@@ -1984,6 +2117,8 @@
     </w:p>
     <w:p>
       <w:pPr>
+        <w:keepNext/>
+        <w:keepLines/>
         <w:spacing w:after="80" w:before="240"/>
       </w:pPr>
       <w:r>
@@ -1999,6 +2134,8 @@
     </w:p>
     <w:p>
       <w:pPr>
+        <w:keepNext/>
+        <w:keepLines/>
         <w:spacing w:after="60" w:before="60"/>
       </w:pPr>
       <w:r>
@@ -2022,6 +2159,8 @@
     </w:p>
     <w:p>
       <w:pPr>
+        <w:keepNext/>
+        <w:keepLines/>
         <w:spacing w:after="60" w:before="60"/>
       </w:pPr>
       <w:r>
@@ -2045,6 +2184,7 @@
     </w:p>
     <w:p>
       <w:pPr>
+        <w:keepLines/>
         <w:spacing w:after="120" w:before="60"/>
       </w:pPr>
       <w:r>
@@ -2068,6 +2208,8 @@
     </w:p>
     <w:p>
       <w:pPr>
+        <w:keepNext/>
+        <w:keepLines/>
         <w:spacing w:after="80" w:before="240"/>
       </w:pPr>
       <w:r>
@@ -2083,6 +2225,8 @@
     </w:p>
     <w:p>
       <w:pPr>
+        <w:keepNext/>
+        <w:keepLines/>
         <w:spacing w:after="60" w:before="60"/>
       </w:pPr>
       <w:r>
@@ -2106,6 +2250,8 @@
     </w:p>
     <w:p>
       <w:pPr>
+        <w:keepNext/>
+        <w:keepLines/>
         <w:spacing w:after="60" w:before="60"/>
       </w:pPr>
       <w:r>
@@ -2129,6 +2275,7 @@
     </w:p>
     <w:p>
       <w:pPr>
+        <w:keepLines/>
         <w:spacing w:after="120" w:before="60"/>
       </w:pPr>
       <w:r>
@@ -2147,11 +2294,13 @@
           <w:sz w:val="22"/>
           <w:szCs w:val="22"/>
         </w:rPr>
-        <w:t xml:space="preserve">Na primeira entrada aparece a pergunta “Este navegador tem progresso que não está em nenhuma conta: X missões e Y moedas. Quer juntar esse progresso à sua conta?”, com os números do que foi jogado. Com Cancelar, esse progresso é descartado e a conta B fica só com o que já era dela. Com OK, a missão passa a contar para a conta B. Na última entrada nada é perguntado, porque a conta B já tem tanto quanto o navegador.</w:t>
-      </w:r>
-    </w:p>
-    <w:p>
-      <w:pPr>
+        <w:t xml:space="preserve">Na primeira entrada aparece a pergunta “Este navegador tem progresso que não está em nenhuma conta: X missões e Y moedas. Quer juntar esse progresso à sua conta?”, com os números do que foi jogado. Com Cancelar, esse progresso é descartado e a conta B fica só com o que já era dela. Com OK, a missão passa a contar para a conta B. Na última entrada nada é perguntado, porque a conta B já tem tanto quanto o navegador. Se a pergunta aparecer, confira se desta vez o navegador ganhou uma conquista que a conta B ainda não tinha, como a de vencer um minigame sem perder vida. Nesse caso a pergunta está certa, porque o navegador tem algo a mais.</w:t>
+      </w:r>
+    </w:p>
+    <w:p>
+      <w:pPr>
+        <w:keepNext/>
+        <w:keepLines/>
         <w:spacing w:after="80" w:before="240"/>
       </w:pPr>
       <w:r>
@@ -2167,6 +2316,8 @@
     </w:p>
     <w:p>
       <w:pPr>
+        <w:keepNext/>
+        <w:keepLines/>
         <w:spacing w:after="60" w:before="60"/>
       </w:pPr>
       <w:r>
@@ -2190,6 +2341,8 @@
     </w:p>
     <w:p>
       <w:pPr>
+        <w:keepNext/>
+        <w:keepLines/>
         <w:spacing w:after="60" w:before="60"/>
       </w:pPr>
       <w:r>
@@ -2213,6 +2366,7 @@
     </w:p>
     <w:p>
       <w:pPr>
+        <w:keepLines/>
         <w:spacing w:after="120" w:before="60"/>
       </w:pPr>
       <w:r>
@@ -2253,6 +2407,8 @@
     </w:p>
     <w:p>
       <w:pPr>
+        <w:keepNext/>
+        <w:keepLines/>
         <w:spacing w:after="80" w:before="240"/>
       </w:pPr>
       <w:r>
@@ -2268,6 +2424,8 @@
     </w:p>
     <w:p>
       <w:pPr>
+        <w:keepNext/>
+        <w:keepLines/>
         <w:spacing w:after="60" w:before="60"/>
       </w:pPr>
       <w:r>
@@ -2291,6 +2449,8 @@
     </w:p>
     <w:p>
       <w:pPr>
+        <w:keepNext/>
+        <w:keepLines/>
         <w:spacing w:after="60" w:before="60"/>
       </w:pPr>
       <w:r>
@@ -2314,6 +2474,7 @@
     </w:p>
     <w:p>
       <w:pPr>
+        <w:keepLines/>
         <w:spacing w:after="120" w:before="60"/>
       </w:pPr>
       <w:r>
@@ -2337,6 +2498,8 @@
     </w:p>
     <w:p>
       <w:pPr>
+        <w:keepNext/>
+        <w:keepLines/>
         <w:spacing w:after="80" w:before="240"/>
       </w:pPr>
       <w:r>
@@ -2352,6 +2515,8 @@
     </w:p>
     <w:p>
       <w:pPr>
+        <w:keepNext/>
+        <w:keepLines/>
         <w:spacing w:after="60" w:before="60"/>
       </w:pPr>
       <w:r>
@@ -2375,6 +2540,8 @@
     </w:p>
     <w:p>
       <w:pPr>
+        <w:keepNext/>
+        <w:keepLines/>
         <w:spacing w:after="60" w:before="60"/>
       </w:pPr>
       <w:r>
@@ -2398,6 +2565,7 @@
     </w:p>
     <w:p>
       <w:pPr>
+        <w:keepLines/>
         <w:spacing w:after="120" w:before="60"/>
       </w:pPr>
       <w:r>
@@ -2421,6 +2589,8 @@
     </w:p>
     <w:p>
       <w:pPr>
+        <w:keepNext/>
+        <w:keepLines/>
         <w:spacing w:after="80" w:before="240"/>
       </w:pPr>
       <w:r>
@@ -2436,6 +2606,8 @@
     </w:p>
     <w:p>
       <w:pPr>
+        <w:keepNext/>
+        <w:keepLines/>
         <w:spacing w:after="60" w:before="60"/>
       </w:pPr>
       <w:r>
@@ -2459,6 +2631,8 @@
     </w:p>
     <w:p>
       <w:pPr>
+        <w:keepNext/>
+        <w:keepLines/>
         <w:spacing w:after="60" w:before="60"/>
       </w:pPr>
       <w:r>
@@ -2482,6 +2656,7 @@
     </w:p>
     <w:p>
       <w:pPr>
+        <w:keepLines/>
         <w:spacing w:after="120" w:before="60"/>
       </w:pPr>
       <w:r>
@@ -2505,6 +2680,8 @@
     </w:p>
     <w:p>
       <w:pPr>
+        <w:keepNext/>
+        <w:keepLines/>
         <w:spacing w:after="80" w:before="240"/>
       </w:pPr>
       <w:r>
@@ -2520,6 +2697,8 @@
     </w:p>
     <w:p>
       <w:pPr>
+        <w:keepNext/>
+        <w:keepLines/>
         <w:spacing w:after="60" w:before="60"/>
       </w:pPr>
       <w:r>
@@ -2543,6 +2722,8 @@
     </w:p>
     <w:p>
       <w:pPr>
+        <w:keepNext/>
+        <w:keepLines/>
         <w:spacing w:after="60" w:before="60"/>
       </w:pPr>
       <w:r>
@@ -2566,6 +2747,7 @@
     </w:p>
     <w:p>
       <w:pPr>
+        <w:keepLines/>
         <w:spacing w:after="120" w:before="60"/>
       </w:pPr>
       <w:r>
@@ -2589,6 +2771,8 @@
     </w:p>
     <w:p>
       <w:pPr>
+        <w:keepNext/>
+        <w:keepLines/>
         <w:spacing w:after="80" w:before="240"/>
       </w:pPr>
       <w:r>
@@ -2604,6 +2788,8 @@
     </w:p>
     <w:p>
       <w:pPr>
+        <w:keepNext/>
+        <w:keepLines/>
         <w:spacing w:after="60" w:before="60"/>
       </w:pPr>
       <w:r>
@@ -2627,6 +2813,8 @@
     </w:p>
     <w:p>
       <w:pPr>
+        <w:keepNext/>
+        <w:keepLines/>
         <w:spacing w:after="60" w:before="60"/>
       </w:pPr>
       <w:r>
@@ -2650,6 +2838,7 @@
     </w:p>
     <w:p>
       <w:pPr>
+        <w:keepLines/>
         <w:spacing w:after="120" w:before="60"/>
       </w:pPr>
       <w:r>
@@ -2703,6 +2892,8 @@
     </w:p>
     <w:p>
       <w:pPr>
+        <w:keepNext/>
+        <w:keepLines/>
         <w:spacing w:after="80" w:before="240"/>
       </w:pPr>
       <w:r>
@@ -2718,6 +2909,8 @@
     </w:p>
     <w:p>
       <w:pPr>
+        <w:keepNext/>
+        <w:keepLines/>
         <w:spacing w:after="60" w:before="60"/>
       </w:pPr>
       <w:r>
@@ -2741,6 +2934,8 @@
     </w:p>
     <w:p>
       <w:pPr>
+        <w:keepNext/>
+        <w:keepLines/>
         <w:spacing w:after="60" w:before="60"/>
       </w:pPr>
       <w:r>
@@ -2764,6 +2959,7 @@
     </w:p>
     <w:p>
       <w:pPr>
+        <w:keepLines/>
         <w:spacing w:after="120" w:before="60"/>
       </w:pPr>
       <w:r>
@@ -2787,6 +2983,8 @@
     </w:p>
     <w:p>
       <w:pPr>
+        <w:keepNext/>
+        <w:keepLines/>
         <w:spacing w:after="80" w:before="240"/>
       </w:pPr>
       <w:r>
@@ -2802,6 +3000,8 @@
     </w:p>
     <w:p>
       <w:pPr>
+        <w:keepNext/>
+        <w:keepLines/>
         <w:spacing w:after="60" w:before="60"/>
       </w:pPr>
       <w:r>
@@ -2825,6 +3025,8 @@
     </w:p>
     <w:p>
       <w:pPr>
+        <w:keepNext/>
+        <w:keepLines/>
         <w:spacing w:after="60" w:before="60"/>
       </w:pPr>
       <w:r>
@@ -2848,6 +3050,7 @@
     </w:p>
     <w:p>
       <w:pPr>
+        <w:keepLines/>
         <w:spacing w:after="120" w:before="60"/>
       </w:pPr>
       <w:r>
@@ -2866,11 +3069,13 @@
           <w:sz w:val="22"/>
           <w:szCs w:val="22"/>
         </w:rPr>
-        <w:t xml:space="preserve">As duas camadas aparecem ativas. A da Vercel roda uma vez por dia entre 08:00 e 08:59 UTC, e a do GitHub às 08:23 UTC. O endereço /api/keep-alive responde {"ok":false,"erro":"nao autorizado"}, sinal de que a variável CRON_SECRET está cadastrada; se responder {"ok":true}, ela sumiu da Vercel. Se o fluxo do GitHub estiver desabilitado por inatividade do repositório, basta reabilitá-lo pelo botão da própria tela. Isso é comportamento normal da plataforma quando o repositório fica muito tempo sem receber commits.</w:t>
-      </w:r>
-    </w:p>
-    <w:p>
-      <w:pPr>
+        <w:t xml:space="preserve">As duas camadas aparecem ativas. A da Vercel roda uma vez por dia entre 08:00 e 08:59 UTC. A do GitHub está marcada para 08:23 UTC, mas o GitHub atrasa execuções agendadas, e em outubro de 2026 ela rodou entre 12:00 e 16:00 UTC. O endereço /api/keep-alive responde {"ok":false,"erro":"nao autorizado"}, sinal de que a variável CRON_SECRET está cadastrada; se a resposta trouxer "ok":true, ela sumiu da Vercel. Se o fluxo do GitHub estiver desabilitado por inatividade do repositório, basta reabilitá-lo pelo botão da própria tela. Isso é comportamento normal da plataforma quando o repositório fica muito tempo sem receber commits.</w:t>
+      </w:r>
+    </w:p>
+    <w:p>
+      <w:pPr>
+        <w:keepNext/>
+        <w:keepLines/>
         <w:spacing w:after="80" w:before="240"/>
       </w:pPr>
       <w:r>
@@ -2886,6 +3091,8 @@
     </w:p>
     <w:p>
       <w:pPr>
+        <w:keepNext/>
+        <w:keepLines/>
         <w:spacing w:after="60" w:before="60"/>
       </w:pPr>
       <w:r>
@@ -2909,6 +3116,8 @@
     </w:p>
     <w:p>
       <w:pPr>
+        <w:keepNext/>
+        <w:keepLines/>
         <w:spacing w:after="60" w:before="60"/>
       </w:pPr>
       <w:r>
@@ -2932,6 +3141,7 @@
     </w:p>
     <w:p>
       <w:pPr>
+        <w:keepLines/>
         <w:spacing w:after="120" w:before="60"/>
       </w:pPr>
       <w:r>
@@ -2955,6 +3165,8 @@
     </w:p>
     <w:p>
       <w:pPr>
+        <w:keepNext/>
+        <w:keepLines/>
         <w:spacing w:after="80" w:before="240"/>
       </w:pPr>
       <w:r>
@@ -2970,6 +3182,8 @@
     </w:p>
     <w:p>
       <w:pPr>
+        <w:keepNext/>
+        <w:keepLines/>
         <w:spacing w:after="60" w:before="60"/>
       </w:pPr>
       <w:r>
@@ -2993,6 +3207,8 @@
     </w:p>
     <w:p>
       <w:pPr>
+        <w:keepNext/>
+        <w:keepLines/>
         <w:spacing w:after="60" w:before="60"/>
       </w:pPr>
       <w:r>
@@ -3016,6 +3232,7 @@
     </w:p>
     <w:p>
       <w:pPr>
+        <w:keepLines/>
         <w:spacing w:after="120" w:before="60"/>
       </w:pPr>
       <w:r>
@@ -3039,6 +3256,8 @@
     </w:p>
     <w:p>
       <w:pPr>
+        <w:keepNext/>
+        <w:keepLines/>
         <w:spacing w:after="80" w:before="240"/>
       </w:pPr>
       <w:r>
@@ -3054,6 +3273,8 @@
     </w:p>
     <w:p>
       <w:pPr>
+        <w:keepNext/>
+        <w:keepLines/>
         <w:spacing w:after="60" w:before="60"/>
       </w:pPr>
       <w:r>
@@ -3077,6 +3298,8 @@
     </w:p>
     <w:p>
       <w:pPr>
+        <w:keepNext/>
+        <w:keepLines/>
         <w:spacing w:after="60" w:before="60"/>
       </w:pPr>
       <w:r>
@@ -3100,6 +3323,7 @@
     </w:p>
     <w:p>
       <w:pPr>
+        <w:keepLines/>
         <w:spacing w:after="120" w:before="60"/>
       </w:pPr>
       <w:r>
@@ -3336,7 +3560,7 @@
     </w:p>
     <w:tbl>
       <w:tblPr>
-        <w:tblW w:type="dxa" w:w="8800"/>
+        <w:tblW w:type="dxa" w:w="9638"/>
         <w:tblBorders>
           <w:top w:val="single" w:color="auto" w:sz="4"/>
           <w:left w:val="single" w:color="auto" w:sz="4"/>
@@ -3347,16 +3571,17 @@
         </w:tblBorders>
       </w:tblPr>
       <w:tblGrid>
-        <w:gridCol w:w="3400"/>
-        <w:gridCol w:w="5400"/>
+        <w:gridCol w:w="3724"/>
+        <w:gridCol w:w="5914"/>
       </w:tblGrid>
       <w:tr>
         <w:trPr>
+          <w:cantSplit/>
           <w:tblHeader/>
         </w:trPr>
         <w:tc>
           <w:tcPr>
-            <w:tcW w:type="dxa" w:w="3400"/>
+            <w:tcW w:type="dxa" w:w="3724"/>
             <w:shd w:fill="E8F2EC" w:val="clear"/>
             <w:tcMar>
               <w:top w:type="dxa" w:w="80"/>
@@ -3383,7 +3608,7 @@
         </w:tc>
         <w:tc>
           <w:tcPr>
-            <w:tcW w:type="dxa" w:w="5400"/>
+            <w:tcW w:type="dxa" w:w="5914"/>
             <w:shd w:fill="E8F2EC" w:val="clear"/>
             <w:tcMar>
               <w:top w:type="dxa" w:w="80"/>
@@ -3410,15 +3635,20 @@
         </w:tc>
       </w:tr>
       <w:tr>
+        <w:trPr>
+          <w:cantSplit/>
+          <w:trHeight w:val="560" w:hRule="atLeast"/>
+        </w:trPr>
         <w:tc>
           <w:tcPr>
-            <w:tcW w:type="dxa" w:w="3400"/>
+            <w:tcW w:type="dxa" w:w="3724"/>
             <w:tcMar>
               <w:top w:type="dxa" w:w="80"/>
               <w:left w:type="dxa" w:w="120"/>
               <w:bottom w:type="dxa" w:w="80"/>
               <w:right w:type="dxa" w:w="120"/>
             </w:tcMar>
+            <w:vAlign w:val="center"/>
           </w:tcPr>
           <w:p>
             <w:pPr>
@@ -3438,13 +3668,14 @@
         </w:tc>
         <w:tc>
           <w:tcPr>
-            <w:tcW w:type="dxa" w:w="5400"/>
+            <w:tcW w:type="dxa" w:w="5914"/>
             <w:tcMar>
               <w:top w:type="dxa" w:w="80"/>
               <w:left w:type="dxa" w:w="120"/>
               <w:bottom w:type="dxa" w:w="80"/>
               <w:right w:type="dxa" w:w="120"/>
             </w:tcMar>
+            <w:vAlign w:val="center"/>
           </w:tcPr>
           <w:p>
             <w:pPr>
@@ -3464,15 +3695,20 @@
         </w:tc>
       </w:tr>
       <w:tr>
+        <w:trPr>
+          <w:cantSplit/>
+          <w:trHeight w:val="560" w:hRule="atLeast"/>
+        </w:trPr>
         <w:tc>
           <w:tcPr>
-            <w:tcW w:type="dxa" w:w="3400"/>
+            <w:tcW w:type="dxa" w:w="3724"/>
             <w:tcMar>
               <w:top w:type="dxa" w:w="80"/>
               <w:left w:type="dxa" w:w="120"/>
               <w:bottom w:type="dxa" w:w="80"/>
               <w:right w:type="dxa" w:w="120"/>
             </w:tcMar>
+            <w:vAlign w:val="center"/>
           </w:tcPr>
           <w:p>
             <w:pPr>
@@ -3492,13 +3728,14 @@
         </w:tc>
         <w:tc>
           <w:tcPr>
-            <w:tcW w:type="dxa" w:w="5400"/>
+            <w:tcW w:type="dxa" w:w="5914"/>
             <w:tcMar>
               <w:top w:type="dxa" w:w="80"/>
               <w:left w:type="dxa" w:w="120"/>
               <w:bottom w:type="dxa" w:w="80"/>
               <w:right w:type="dxa" w:w="120"/>
             </w:tcMar>
+            <w:vAlign w:val="center"/>
           </w:tcPr>
           <w:p>
             <w:pPr>
@@ -3518,15 +3755,20 @@
         </w:tc>
       </w:tr>
       <w:tr>
+        <w:trPr>
+          <w:cantSplit/>
+          <w:trHeight w:val="560" w:hRule="atLeast"/>
+        </w:trPr>
         <w:tc>
           <w:tcPr>
-            <w:tcW w:type="dxa" w:w="3400"/>
+            <w:tcW w:type="dxa" w:w="3724"/>
             <w:tcMar>
               <w:top w:type="dxa" w:w="80"/>
               <w:left w:type="dxa" w:w="120"/>
               <w:bottom w:type="dxa" w:w="80"/>
               <w:right w:type="dxa" w:w="120"/>
             </w:tcMar>
+            <w:vAlign w:val="center"/>
           </w:tcPr>
           <w:p>
             <w:pPr>
@@ -3546,13 +3788,14 @@
         </w:tc>
         <w:tc>
           <w:tcPr>
-            <w:tcW w:type="dxa" w:w="5400"/>
+            <w:tcW w:type="dxa" w:w="5914"/>
             <w:tcMar>
               <w:top w:type="dxa" w:w="80"/>
               <w:left w:type="dxa" w:w="120"/>
               <w:bottom w:type="dxa" w:w="80"/>
               <w:right w:type="dxa" w:w="120"/>
             </w:tcMar>
+            <w:vAlign w:val="center"/>
           </w:tcPr>
           <w:p>
             <w:pPr>
@@ -3572,15 +3815,20 @@
         </w:tc>
       </w:tr>
       <w:tr>
+        <w:trPr>
+          <w:cantSplit/>
+          <w:trHeight w:val="560" w:hRule="atLeast"/>
+        </w:trPr>
         <w:tc>
           <w:tcPr>
-            <w:tcW w:type="dxa" w:w="3400"/>
+            <w:tcW w:type="dxa" w:w="3724"/>
             <w:tcMar>
               <w:top w:type="dxa" w:w="80"/>
               <w:left w:type="dxa" w:w="120"/>
               <w:bottom w:type="dxa" w:w="80"/>
               <w:right w:type="dxa" w:w="120"/>
             </w:tcMar>
+            <w:vAlign w:val="center"/>
           </w:tcPr>
           <w:p>
             <w:pPr>
@@ -3600,13 +3848,14 @@
         </w:tc>
         <w:tc>
           <w:tcPr>
-            <w:tcW w:type="dxa" w:w="5400"/>
+            <w:tcW w:type="dxa" w:w="5914"/>
             <w:tcMar>
               <w:top w:type="dxa" w:w="80"/>
               <w:left w:type="dxa" w:w="120"/>
               <w:bottom w:type="dxa" w:w="80"/>
               <w:right w:type="dxa" w:w="120"/>
             </w:tcMar>
+            <w:vAlign w:val="center"/>
           </w:tcPr>
           <w:p>
             <w:pPr>
@@ -3626,15 +3875,20 @@
         </w:tc>
       </w:tr>
       <w:tr>
+        <w:trPr>
+          <w:cantSplit/>
+          <w:trHeight w:val="560" w:hRule="atLeast"/>
+        </w:trPr>
         <w:tc>
           <w:tcPr>
-            <w:tcW w:type="dxa" w:w="3400"/>
+            <w:tcW w:type="dxa" w:w="3724"/>
             <w:tcMar>
               <w:top w:type="dxa" w:w="80"/>
               <w:left w:type="dxa" w:w="120"/>
               <w:bottom w:type="dxa" w:w="80"/>
               <w:right w:type="dxa" w:w="120"/>
             </w:tcMar>
+            <w:vAlign w:val="center"/>
           </w:tcPr>
           <w:p>
             <w:pPr>
@@ -3654,13 +3908,14 @@
         </w:tc>
         <w:tc>
           <w:tcPr>
-            <w:tcW w:type="dxa" w:w="5400"/>
+            <w:tcW w:type="dxa" w:w="5914"/>
             <w:tcMar>
               <w:top w:type="dxa" w:w="80"/>
               <w:left w:type="dxa" w:w="120"/>
               <w:bottom w:type="dxa" w:w="80"/>
               <w:right w:type="dxa" w:w="120"/>
             </w:tcMar>
+            <w:vAlign w:val="center"/>
           </w:tcPr>
           <w:p>
             <w:pPr>
@@ -3680,15 +3935,20 @@
         </w:tc>
       </w:tr>
       <w:tr>
+        <w:trPr>
+          <w:cantSplit/>
+          <w:trHeight w:val="560" w:hRule="atLeast"/>
+        </w:trPr>
         <w:tc>
           <w:tcPr>
-            <w:tcW w:type="dxa" w:w="3400"/>
+            <w:tcW w:type="dxa" w:w="3724"/>
             <w:tcMar>
               <w:top w:type="dxa" w:w="80"/>
               <w:left w:type="dxa" w:w="120"/>
               <w:bottom w:type="dxa" w:w="80"/>
               <w:right w:type="dxa" w:w="120"/>
             </w:tcMar>
+            <w:vAlign w:val="center"/>
           </w:tcPr>
           <w:p>
             <w:pPr>
@@ -3708,13 +3968,14 @@
         </w:tc>
         <w:tc>
           <w:tcPr>
-            <w:tcW w:type="dxa" w:w="5400"/>
+            <w:tcW w:type="dxa" w:w="5914"/>
             <w:tcMar>
               <w:top w:type="dxa" w:w="80"/>
               <w:left w:type="dxa" w:w="120"/>
               <w:bottom w:type="dxa" w:w="80"/>
               <w:right w:type="dxa" w:w="120"/>
             </w:tcMar>
+            <w:vAlign w:val="center"/>
           </w:tcPr>
           <w:p>
             <w:pPr>
@@ -3734,15 +3995,20 @@
         </w:tc>
       </w:tr>
       <w:tr>
+        <w:trPr>
+          <w:cantSplit/>
+          <w:trHeight w:val="560" w:hRule="atLeast"/>
+        </w:trPr>
         <w:tc>
           <w:tcPr>
-            <w:tcW w:type="dxa" w:w="3400"/>
+            <w:tcW w:type="dxa" w:w="3724"/>
             <w:tcMar>
               <w:top w:type="dxa" w:w="80"/>
               <w:left w:type="dxa" w:w="120"/>
               <w:bottom w:type="dxa" w:w="80"/>
               <w:right w:type="dxa" w:w="120"/>
             </w:tcMar>
+            <w:vAlign w:val="center"/>
           </w:tcPr>
           <w:p>
             <w:pPr>
@@ -3762,13 +4028,14 @@
         </w:tc>
         <w:tc>
           <w:tcPr>
-            <w:tcW w:type="dxa" w:w="5400"/>
+            <w:tcW w:type="dxa" w:w="5914"/>
             <w:tcMar>
               <w:top w:type="dxa" w:w="80"/>
               <w:left w:type="dxa" w:w="120"/>
               <w:bottom w:type="dxa" w:w="80"/>
               <w:right w:type="dxa" w:w="120"/>
             </w:tcMar>
+            <w:vAlign w:val="center"/>
           </w:tcPr>
           <w:p>
             <w:pPr>
@@ -3802,9 +4069,11 @@
       </w:r>
     </w:p>
     <w:sectPr>
+      <w:footerReference w:type="default" r:id="rIdRodape"/>
       <w:pgSz w:w="11906" w:h="16838" w:orient="portrait"/>
       <w:pgMar w:top="1134" w:right="1134" w:bottom="1134" w:left="1134" w:header="708" w:footer="708" w:gutter="0"/>
       <w:pgNumType/>
+      <w:titlePg/>
       <w:docGrid w:linePitch="360"/>
     </w:sectPr>
   </w:body>
@@ -3850,6 +4119,124 @@
     </w:p>
   </w:endnote>
 </w:endnotes>
+</file>
+
+<file path=word/footer1.xml><?xml version="1.0" encoding="utf-8"?>
+<w:ftr xmlns:w="http://schemas.openxmlformats.org/wordprocessingml/2006/main" xmlns:r="http://schemas.openxmlformats.org/officeDocument/2006/relationships">
+  <w:p>
+    <w:pPr>
+      <w:jc w:val="center"/>
+    </w:pPr>
+    <w:r>
+      <w:rPr>
+        <w:rFonts w:ascii="Arial" w:hAnsi="Arial" w:cs="Arial" w:eastAsia="Arial"/>
+        <w:color w:val="6B6B6B"/>
+        <w:sz w:val="18"/>
+        <w:szCs w:val="18"/>
+      </w:rPr>
+      <w:t xml:space="preserve">Ecoverse · Bateria de testes · Página </w:t>
+    </w:r>
+    <w:r>
+      <w:rPr>
+        <w:rFonts w:ascii="Arial" w:hAnsi="Arial" w:cs="Arial" w:eastAsia="Arial"/>
+        <w:color w:val="6B6B6B"/>
+        <w:sz w:val="18"/>
+        <w:szCs w:val="18"/>
+      </w:rPr>
+      <w:fldChar w:fldCharType="begin"/>
+    </w:r>
+    <w:r>
+      <w:rPr>
+        <w:rFonts w:ascii="Arial" w:hAnsi="Arial" w:cs="Arial" w:eastAsia="Arial"/>
+        <w:color w:val="6B6B6B"/>
+        <w:sz w:val="18"/>
+        <w:szCs w:val="18"/>
+      </w:rPr>
+      <w:instrText xml:space="preserve"> PAGE </w:instrText>
+    </w:r>
+    <w:r>
+      <w:rPr>
+        <w:rFonts w:ascii="Arial" w:hAnsi="Arial" w:cs="Arial" w:eastAsia="Arial"/>
+        <w:color w:val="6B6B6B"/>
+        <w:sz w:val="18"/>
+        <w:szCs w:val="18"/>
+      </w:rPr>
+      <w:fldChar w:fldCharType="separate"/>
+    </w:r>
+    <w:r>
+      <w:rPr>
+        <w:rFonts w:ascii="Arial" w:hAnsi="Arial" w:cs="Arial" w:eastAsia="Arial"/>
+        <w:color w:val="6B6B6B"/>
+        <w:sz w:val="18"/>
+        <w:szCs w:val="18"/>
+      </w:rPr>
+      <w:t>2</w:t>
+    </w:r>
+    <w:r>
+      <w:rPr>
+        <w:rFonts w:ascii="Arial" w:hAnsi="Arial" w:cs="Arial" w:eastAsia="Arial"/>
+        <w:color w:val="6B6B6B"/>
+        <w:sz w:val="18"/>
+        <w:szCs w:val="18"/>
+      </w:rPr>
+      <w:fldChar w:fldCharType="end"/>
+    </w:r>
+    <w:r>
+      <w:rPr>
+        <w:rFonts w:ascii="Arial" w:hAnsi="Arial" w:cs="Arial" w:eastAsia="Arial"/>
+        <w:color w:val="6B6B6B"/>
+        <w:sz w:val="18"/>
+        <w:szCs w:val="18"/>
+      </w:rPr>
+      <w:t xml:space="preserve"> de </w:t>
+    </w:r>
+    <w:r>
+      <w:rPr>
+        <w:rFonts w:ascii="Arial" w:hAnsi="Arial" w:cs="Arial" w:eastAsia="Arial"/>
+        <w:color w:val="6B6B6B"/>
+        <w:sz w:val="18"/>
+        <w:szCs w:val="18"/>
+      </w:rPr>
+      <w:fldChar w:fldCharType="begin"/>
+    </w:r>
+    <w:r>
+      <w:rPr>
+        <w:rFonts w:ascii="Arial" w:hAnsi="Arial" w:cs="Arial" w:eastAsia="Arial"/>
+        <w:color w:val="6B6B6B"/>
+        <w:sz w:val="18"/>
+        <w:szCs w:val="18"/>
+      </w:rPr>
+      <w:instrText xml:space="preserve"> NUMPAGES </w:instrText>
+    </w:r>
+    <w:r>
+      <w:rPr>
+        <w:rFonts w:ascii="Arial" w:hAnsi="Arial" w:cs="Arial" w:eastAsia="Arial"/>
+        <w:color w:val="6B6B6B"/>
+        <w:sz w:val="18"/>
+        <w:szCs w:val="18"/>
+      </w:rPr>
+      <w:fldChar w:fldCharType="separate"/>
+    </w:r>
+    <w:r>
+      <w:rPr>
+        <w:rFonts w:ascii="Arial" w:hAnsi="Arial" w:cs="Arial" w:eastAsia="Arial"/>
+        <w:color w:val="6B6B6B"/>
+        <w:sz w:val="18"/>
+        <w:szCs w:val="18"/>
+      </w:rPr>
+      <w:t>2</w:t>
+    </w:r>
+    <w:r>
+      <w:rPr>
+        <w:rFonts w:ascii="Arial" w:hAnsi="Arial" w:cs="Arial" w:eastAsia="Arial"/>
+        <w:color w:val="6B6B6B"/>
+        <w:sz w:val="18"/>
+        <w:szCs w:val="18"/>
+      </w:rPr>
+      <w:fldChar w:fldCharType="end"/>
+    </w:r>
+  </w:p>
+</w:ftr>
 </file>
 
 <file path=word/footnotes.xml><?xml version="1.0" encoding="utf-8"?>
@@ -3992,6 +4379,7 @@
         <w:rFonts w:ascii="Arial" w:cs="Arial" w:eastAsia="Arial" w:hAnsi="Arial"/>
         <w:sz w:val="22"/>
         <w:szCs w:val="22"/>
+        <w:lang w:val="pt-BR" w:eastAsia="pt-BR" w:bidi="ar-SA"/>
       </w:rPr>
     </w:rPrDefault>
     <w:pPrDefault/>
@@ -4011,6 +4399,11 @@
     <w:basedOn w:val="Normal"/>
     <w:next w:val="Normal"/>
     <w:qFormat/>
+    <w:pPr>
+      <w:keepNext/>
+      <w:keepLines/>
+      <w:outlineLvl w:val="0"/>
+    </w:pPr>
     <w:rPr>
       <w:color w:val="2E74B5"/>
       <w:sz w:val="32"/>
@@ -4022,6 +4415,11 @@
     <w:basedOn w:val="Normal"/>
     <w:next w:val="Normal"/>
     <w:qFormat/>
+    <w:pPr>
+      <w:keepNext/>
+      <w:keepLines/>
+      <w:outlineLvl w:val="1"/>
+    </w:pPr>
     <w:rPr>
       <w:color w:val="2E74B5"/>
       <w:sz w:val="26"/>
@@ -4033,6 +4431,11 @@
     <w:basedOn w:val="Normal"/>
     <w:next w:val="Normal"/>
     <w:qFormat/>
+    <w:pPr>
+      <w:keepNext/>
+      <w:keepLines/>
+      <w:outlineLvl w:val="2"/>
+    </w:pPr>
     <w:rPr>
       <w:color w:val="1F4D78"/>
       <w:sz w:val="24"/>

</xml_diff>

<commit_message>
docs(entrega): tempo real, modo dev e imagens de terceiros nos documentos
Na transferência, recriar o banco ganha o passo do tempo real da tabela
progress, e os pontos em aberto ganham as imagens de terceiros: a foto
do Pantanal traz nos metadados o nome de um fotógrafo profissional como
dono dos direitos. Na bateria, o atalho ?dev=free e o T25 deixam de
dizer que nada é salvo.
</commit_message>
<xml_diff>
--- a/docs/Ecoverse - Bateria de testes.docx
+++ b/docs/Ecoverse - Bateria de testes.docx
@@ -293,7 +293,7 @@
           <w:sz w:val="22"/>
           <w:szCs w:val="22"/>
         </w:rPr>
-        <w:t xml:space="preserve">acrescentar ?dev=free ao endereço libera todas as missões e a energia, sem precisar completar sessões de Pomodoro. Serve para testar as missões rapidamente. Nesse modo o progresso não é salvo, então use apenas nos testes que pedem explicitamente.</w:t>
+        <w:t xml:space="preserve">acrescentar ?dev=free ao endereço libera todas as missões e a energia, sem precisar completar sessões de Pomodoro. Serve para testar as missões rapidamente. Nesse modo as missões não contam como concluídas, mas quizzes e Pomodoro continuam salvando; por isso, use apenas nos testes que pedem explicitamente.</w:t>
       </w:r>
     </w:p>
     <w:p>
@@ -2651,7 +2651,7 @@
           <w:sz w:val="22"/>
           <w:szCs w:val="22"/>
         </w:rPr>
-        <w:t xml:space="preserve">Abra https://ecoverse.dev/?dev=free, que libera todas as missões sem salvar nada. Com Tab, percorra os marcadores do globo e abra uma missão com Enter ou espaço. Abra os quizzes e acione um quiz liberado com Tab e Enter. Inicie os minigames das missões 5 e 6 e jogue só com o teclado. Depois abra um dos outros minigames.</w:t>
+        <w:t xml:space="preserve">Abra https://ecoverse.dev/?dev=free, que libera todas as missões sem que elas contem como concluídas. Com Tab, percorra os marcadores do globo e abra uma missão com Enter ou espaço. Abra os quizzes e acione um quiz liberado com Tab e Enter. Inicie os minigames das missões 5 e 6 e jogue só com o teclado. Depois abra um dos outros minigames.</w:t>
       </w:r>
     </w:p>
     <w:p>

</xml_diff>